<commit_message>
Add Headings, Running Header and Justified formatting to DTL_Thesis_Design_NEU_MDE_Final.docx
</commit_message>
<xml_diff>
--- a/DTL_Thesis_Design_NEU_MDE_Final.docx
+++ b/DTL_Thesis_Design_NEU_MDE_Final.docx
@@ -81,27 +81,24 @@
       </w:r>
     </w:p>
     <w:p>
+      <w:pPr>
+        <w:pStyle w:val="Heading1"/>
+      </w:pPr>
       <w:r>
-        <w:rPr>
-          <w:b/>
-          <w:color w:val="003366"/>
-          <w:sz w:val="28"/>
-        </w:rPr>
         <w:t>I. Introduction</w:t>
       </w:r>
     </w:p>
     <w:p>
+      <w:pPr>
+        <w:pStyle w:val="Heading2"/>
+      </w:pPr>
       <w:r>
-        <w:rPr>
-          <w:b/>
-          <w:sz w:val="24"/>
-        </w:rPr>
         <w:t>1.1. Research Rationales</w:t>
       </w:r>
     </w:p>
     <w:p>
       <w:pPr>
-        <w:spacing w:line="276" w:lineRule="auto"/>
+        <w:jc w:val="both"/>
       </w:pPr>
       <w:r>
         <w:t>Bank guarantee is an indispensable security instrument closely tied to almost all high-value commercial transactions of corporate enterprises. In the construction and engineering sector, Article 18 of Decree No. 37/2015/ND-CP (amended and supplemented by Decree No. 35/2023/ND-CP) mandates that contractors must submit an advance payment guarantee for contracts with advance payments exceeding 1 billion VND; Bidding Law No. 22/2023/QH15 strictly regulates tender security and performance security obligations. In international trade, bank guarantees issued under the Uniform Rules for Demand Guarantees (URDG 758) substitute cash margin deposits, liberating corporate working capital. Demand for bank guarantee products is therefore mandatory rather than a discretionary corporate choice.</w:t>
@@ -109,7 +106,7 @@
     </w:p>
     <w:p>
       <w:pPr>
-        <w:spacing w:line="276" w:lineRule="auto"/>
+        <w:jc w:val="both"/>
       </w:pPr>
       <w:r>
         <w:t>For commercial banks, guarantee issuance is a signature credit operation—commonly referred to as an off-balance sheet commitment. At the time of issuing a letter of guarantee, the bank does not disburse cash upfront but provides an irrevocable commitment to pay on behalf of the principal if the principal defaults. This contingent liability is monitored off-balance sheet and is converted into an on-balance sheet forced loan only when the bank actually executes the payout.</w:t>
@@ -117,7 +114,7 @@
     </w:p>
     <w:p>
       <w:pPr>
-        <w:spacing w:line="276" w:lineRule="auto"/>
+        <w:jc w:val="both"/>
       </w:pPr>
       <w:r>
         <w:t>This economic mechanism creates three strategic benefits for commercial banks: (i) banks generate steady issuing and maintenance fee income throughout the guarantee term without disbursing capital, building high-margin non-interest income that is resilient to interest rate volatility; (ii) guarantee limits anchor corporate clients into long-term credit relationships, opening cross-selling avenues for deposit, payment, trade finance, and FX products; and (iii) default risk materialises with low probability while off-balance sheet commitments consume regulatory capital at lower Credit Conversion Factors (CCF) compared to funded loans of equivalent value.</w:t>
@@ -125,7 +122,7 @@
     </w:p>
     <w:p>
       <w:pPr>
-        <w:spacing w:line="276" w:lineRule="auto"/>
+        <w:jc w:val="both"/>
       </w:pPr>
       <w:r>
         <w:t>This low-capital, high-fee, customer-anchoring profile makes the guarantee segment intensely competitive among commercial banks. Banks simultaneously lower fee schedules, compress appraisal and issuance lead times, relax collateral and margin requirements, and digitalise procedures to retain and acquire corporate clients. Given that corporate switching costs between issuing banks are relatively low, identifying which criteria corporate clients evaluate and which criteria carry decisive weight provides direct empirical value for VietinBank's product strategy.</w:t>
@@ -133,35 +130,33 @@
     </w:p>
     <w:p>
       <w:pPr>
-        <w:spacing w:line="276" w:lineRule="auto"/>
+        <w:jc w:val="both"/>
       </w:pPr>
       <w:r>
         <w:t>Vietnam's regulatory landscape for guarantee operations has recently undergone fundamental transformation. Circular No. 61/2024/TT-NHNN (effective April 1, 2025, replacing Circular No. 11/2022/TT-NHNN) establishes an updated legal framework for electronic guarantees (e-guarantees). Concurrently, commercial bank digital transformation and cross-border guarantee demand are reshaping corporate selection criteria—factors virtually absent from earlier empirical models. Existing literature shows that bank guarantee products remain under-researched, particularly in Vietnam, where studies focus on retail banking or legal aspects. VietinBank—a Big4 state-owned commercial bank with its VietinBank eFAST digital platform and global correspondent network—provides an ideal empirical context. Hence, the author selects the topic: "Factors Affecting Corporate Customers' Decision to Choose Bank Guarantee Products at Vietnam Joint Stock Commercial Bank for Industry and Trade (VietinBank)".</w:t>
       </w:r>
     </w:p>
     <w:p>
+      <w:pPr>
+        <w:pStyle w:val="Heading2"/>
+      </w:pPr>
       <w:r>
-        <w:rPr>
-          <w:b/>
-          <w:sz w:val="24"/>
-        </w:rPr>
         <w:t>1.2. General Objectives</w:t>
       </w:r>
     </w:p>
     <w:p>
       <w:pPr>
-        <w:spacing w:line="276" w:lineRule="auto"/>
+        <w:jc w:val="both"/>
       </w:pPr>
       <w:r>
         <w:t>The general objective of this research is to identify and measure the impact magnitude of factors influencing corporate customers' decision to choose bank guarantee products at VietinBank, and on that basis, to propose actionable managerial implications helping VietinBank enhance competitiveness and expand market share in this strategic product segment.</w:t>
       </w:r>
     </w:p>
     <w:p>
+      <w:pPr>
+        <w:pStyle w:val="Heading2"/>
+      </w:pPr>
       <w:r>
-        <w:rPr>
-          <w:b/>
-          <w:sz w:val="24"/>
-        </w:rPr>
         <w:t>1.3. Specific Objectives</w:t>
       </w:r>
     </w:p>
@@ -173,8 +168,8 @@
     </w:p>
     <w:p>
       <w:pPr>
-        <w:spacing w:line="276" w:lineRule="auto"/>
-        <w:ind w:left="288"/>
+        <w:ind w:left="360"/>
+        <w:jc w:val="both"/>
       </w:pPr>
       <w:r>
         <w:t>1. What factors affect corporate customers' decision to choose bank guarantee products at VietinBank?</w:t>
@@ -182,8 +177,8 @@
     </w:p>
     <w:p>
       <w:pPr>
-        <w:spacing w:line="276" w:lineRule="auto"/>
-        <w:ind w:left="288"/>
+        <w:ind w:left="360"/>
+        <w:jc w:val="both"/>
       </w:pPr>
       <w:r>
         <w:t>2. What is the direction and magnitude of each factor's impact on the selection decision?</w:t>
@@ -191,8 +186,8 @@
     </w:p>
     <w:p>
       <w:pPr>
-        <w:spacing w:line="276" w:lineRule="auto"/>
-        <w:ind w:left="288"/>
+        <w:ind w:left="360"/>
+        <w:jc w:val="both"/>
       </w:pPr>
       <w:r>
         <w:t>3. Do impact magnitudes differ across corporate subgroups categorized by ownership structure, revenue scale, operating age, and guarantee types used?</w:t>
@@ -200,25 +195,24 @@
     </w:p>
     <w:p>
       <w:pPr>
-        <w:spacing w:line="276" w:lineRule="auto"/>
-        <w:ind w:left="288"/>
+        <w:ind w:left="360"/>
+        <w:jc w:val="both"/>
       </w:pPr>
       <w:r>
         <w:t>4. What managerial implications should VietinBank prioritize to enhance its selection probability as the preferred issuing bank?</w:t>
       </w:r>
     </w:p>
     <w:p>
+      <w:pPr>
+        <w:pStyle w:val="Heading2"/>
+      </w:pPr>
       <w:r>
-        <w:rPr>
-          <w:b/>
-          <w:sz w:val="24"/>
-        </w:rPr>
         <w:t>1.4. Thesis Structure</w:t>
       </w:r>
     </w:p>
     <w:p>
       <w:pPr>
-        <w:spacing w:line="276" w:lineRule="auto"/>
+        <w:jc w:val="both"/>
       </w:pPr>
       <w:r>
         <w:t>This thesis comprises four main chapters:</w:t>
@@ -232,29 +226,25 @@
         <w:t>• Chapter 4: Empirical Results, Discussion and Policy Recommendations – Reports descriptive statistics, reliability tests, EFA, and regression results; discusses findings; and details managerial recommendations for VietinBank.</w:t>
       </w:r>
     </w:p>
-    <w:p/>
     <w:p>
+      <w:pPr>
+        <w:pStyle w:val="Heading1"/>
+      </w:pPr>
       <w:r>
-        <w:rPr>
-          <w:b/>
-          <w:color w:val="003366"/>
-          <w:sz w:val="28"/>
-        </w:rPr>
         <w:t>II. Literature Review</w:t>
       </w:r>
     </w:p>
     <w:p>
+      <w:pPr>
+        <w:pStyle w:val="Heading2"/>
+      </w:pPr>
       <w:r>
-        <w:rPr>
-          <w:b/>
-          <w:sz w:val="24"/>
-        </w:rPr>
         <w:t>2.1. Theoretical Foundations and Legal Context</w:t>
       </w:r>
     </w:p>
     <w:p>
       <w:pPr>
-        <w:spacing w:line="276" w:lineRule="auto"/>
+        <w:jc w:val="both"/>
       </w:pPr>
       <w:r>
         <w:t>Under Vietnamese law, Circular No. 61/2024/TT-NHNN (effective April 1, 2025, replacing Circular No. 11/2022/TT-NHNN and Circular No. 49/2024/TT-NHNN) defines bank guarantee as a form of credit extension wherein the guarantor (credit institution) commits to the beneficiary to perform financial obligations on behalf of the principal should the principal fail to perform. Article 335 of the 2015 Civil Code establishes general guarantee principles. Economically, bank guarantees are non-funded credit instruments that reallocate default risk, enable trust in commercial dealings, and conserve corporate cash flow. International practice under ICC URDG 758 highlights the principle of independence and documentary character.</w:t>
@@ -262,7 +252,7 @@
     </w:p>
     <w:p>
       <w:pPr>
-        <w:spacing w:line="276" w:lineRule="auto"/>
+        <w:jc w:val="both"/>
       </w:pPr>
       <w:r>
         <w:t>Guarantee operations involve a tri-partite relationship comprising the Guarantor (VietinBank), Principal (Corporate Client), and Beneficiary (Project Owner/Buyer). Key product lines include Tender Guarantee (TG), Performance Guarantee (PG), Advance Payment Guarantee, Payment Guarantee (BG), Maintenance Guarantee, and Counter Guarantee.</w:t>
@@ -270,7 +260,7 @@
     </w:p>
     <w:p>
       <w:pPr>
-        <w:spacing w:line="276" w:lineRule="auto"/>
+        <w:jc w:val="both"/>
       </w:pPr>
       <w:r>
         <w:t>Corporate bank selection represents organizational buying behavior explained by three integrated theoretical models:</w:t>
@@ -283,45 +273,40 @@
       </w:r>
     </w:p>
     <w:p>
+      <w:pPr>
+        <w:pStyle w:val="Heading2"/>
+      </w:pPr>
       <w:r>
-        <w:rPr>
-          <w:b/>
-          <w:sz w:val="24"/>
-        </w:rPr>
         <w:t>2.2. Empirical Review and Research Gaps</w:t>
       </w:r>
     </w:p>
     <w:p>
       <w:pPr>
-        <w:spacing w:line="276" w:lineRule="auto"/>
+        <w:jc w:val="both"/>
       </w:pPr>
       <w:r>
         <w:t>Empirical literature spans corporate bank selection (Turnbull &amp; Gibbs, 1989; Narteh, 2013; Kaur et al., 2021; Zelie, 2023), Vietnamese banking service quality (Phan Thi Hang Nga et al., 2024; Ho Dinh Phi et al., 2023; Nguyen et al., 2024), and trade/construction guarantees (Oke, 2018; Hassan et al., 2018; Carletti et al., 2023). Four critical research gaps emerge: (i) separation between general bank selection literature and guarantee-specific empirical quantitative models; (ii) lack of guarantee-focused corporate selection studies in Vietnam; (iii) omission of modern digital (e-guarantees), customization, and legal risk advisory dimensions; and (iv) absence of large-scale system-wide empirical studies at VietinBank.</w:t>
       </w:r>
     </w:p>
-    <w:p/>
     <w:p>
+      <w:pPr>
+        <w:pStyle w:val="Heading1"/>
+      </w:pPr>
       <w:r>
-        <w:rPr>
-          <w:b/>
-          <w:color w:val="003366"/>
-          <w:sz w:val="28"/>
-        </w:rPr>
         <w:t>III. Empirical Analysis</w:t>
       </w:r>
     </w:p>
     <w:p>
+      <w:pPr>
+        <w:pStyle w:val="Heading2"/>
+      </w:pPr>
       <w:r>
-        <w:rPr>
-          <w:b/>
-          <w:sz w:val="24"/>
-        </w:rPr>
         <w:t>3.1. Methodology and Proposed Model</w:t>
       </w:r>
     </w:p>
     <w:p>
       <w:pPr>
-        <w:spacing w:line="276" w:lineRule="auto"/>
+        <w:jc w:val="both"/>
       </w:pPr>
       <w:r>
         <w:t>The study employs a multiple linear regression model with one dependent variable—Corporate Selection Decision (DEC)—and 10 independent variables (X1 to X10). All variables are latent constructs measured via 5-point Likert scale items. The primary regression equation is specified as:</w:t>
@@ -357,11 +342,11 @@
         <w:tblLook w:firstColumn="1" w:firstRow="1" w:lastColumn="0" w:lastRow="0" w:noHBand="0" w:noVBand="1" w:val="04A0"/>
       </w:tblPr>
       <w:tblGrid>
-        <w:gridCol w:w="1987"/>
-        <w:gridCol w:w="1987"/>
-        <w:gridCol w:w="1987"/>
-        <w:gridCol w:w="1987"/>
-        <w:gridCol w:w="1987"/>
+        <w:gridCol w:w="1872"/>
+        <w:gridCol w:w="1872"/>
+        <w:gridCol w:w="1872"/>
+        <w:gridCol w:w="1872"/>
+        <w:gridCol w:w="1872"/>
       </w:tblGrid>
       <w:tr>
         <w:tc>
@@ -1198,36 +1183,33 @@
         </w:tc>
       </w:tr>
     </w:tbl>
-    <w:p/>
     <w:p>
+      <w:pPr>
+        <w:pStyle w:val="Heading2"/>
+      </w:pPr>
       <w:r>
-        <w:rPr>
-          <w:b/>
-          <w:sz w:val="24"/>
-        </w:rPr>
         <w:t>3.2. Data Collection and Pre-Tests</w:t>
       </w:r>
     </w:p>
     <w:p>
       <w:pPr>
-        <w:spacing w:line="276" w:lineRule="auto"/>
+        <w:jc w:val="both"/>
       </w:pPr>
       <w:r>
         <w:t>Rather than administering a new small-scale survey, this study inherits an existing system-wide corporate survey dataset conducted by VietinBank across its corporate client base nationwide. The sampling frame covers corporate enterprises actively utilizing guarantee services across 155 VietinBank branches. The target dataset comprises n = 800 to n = 10,000 corporate respondents, far exceeding minimum sample size thresholds (n &gt;= 185 for EFA; n &gt;= 138 for regression). Pre-tests include data cleaning (removing missing values and straight-lining responses), descriptive statistics, Cronbach's Alpha reliability testing (threshold &gt;= 0.6), Exploratory Factor Analysis (KMO &gt;= 0.5, Bartlett sig &lt; 0.05, Variance Explained &gt; 50%), Pearson correlation, and VIF multicollinearity diagnostics (VIF &lt; 10, ideally &lt; 2). All estimations are executed in SPSS 26.</w:t>
       </w:r>
     </w:p>
     <w:p>
+      <w:pPr>
+        <w:pStyle w:val="Heading2"/>
+      </w:pPr>
       <w:r>
-        <w:rPr>
-          <w:b/>
-          <w:sz w:val="24"/>
-        </w:rPr>
         <w:t>3.3. Anticipated Findings and Interpretation</w:t>
       </w:r>
     </w:p>
     <w:p>
       <w:pPr>
-        <w:spacing w:line="276" w:lineRule="auto"/>
+        <w:jc w:val="both"/>
       </w:pPr>
       <w:r>
         <w:t>Based on theoretical frameworks and banking context, the following results are anticipated:</w:t>
@@ -1237,40 +1219,34 @@
         <w:t>• All positive-dimension attributes (X2 to X10) are expected to yield positive coefficients (β2 to β10 &gt; 0). Digitalisation (DIG) and Processing Speed (SPE) are projected to emerge among the strongest determinants, reflecting corporate urgency in tender deadlines. Customisation (CUS) and Legal Risk Advisory (RSK) will validate the strategic value of tailored banking solutions.</w:t>
       </w:r>
     </w:p>
-    <w:p/>
     <w:p>
+      <w:pPr>
+        <w:pStyle w:val="Heading1"/>
+      </w:pPr>
       <w:r>
-        <w:rPr>
-          <w:b/>
-          <w:color w:val="003366"/>
-          <w:sz w:val="28"/>
-        </w:rPr>
         <w:t>IV. Conclusions</w:t>
       </w:r>
     </w:p>
     <w:p>
       <w:pPr>
-        <w:spacing w:line="276" w:lineRule="auto"/>
+        <w:jc w:val="both"/>
       </w:pPr>
       <w:r>
         <w:t>This thesis design establishes a comprehensive empirical framework investigating corporate bank guarantee selection decisions at VietinBank. By integrating classical SERVQUAL and TPB frameworks with four novel operational dimensions (e-guarantees, customization, legal risk advisory, and global correspondent network), the study fills critical empirical gaps in Vietnam's banking literature. Managerial recommendations will guide VietinBank in risk-based fee optimization, eFAST Straight-Through Processing (STP) auto-approval limits, flexible margin policies, and international correspondent network expansion.</w:t>
       </w:r>
     </w:p>
-    <w:p/>
     <w:p>
+      <w:pPr>
+        <w:pStyle w:val="Heading1"/>
+      </w:pPr>
       <w:r>
-        <w:rPr>
-          <w:b/>
-          <w:color w:val="003366"/>
-          <w:sz w:val="28"/>
-        </w:rPr>
         <w:t>V. References</w:t>
       </w:r>
     </w:p>
     <w:p>
       <w:pPr>
-        <w:spacing w:line="276" w:lineRule="auto"/>
         <w:ind w:left="576" w:hanging="576"/>
+        <w:jc w:val="both"/>
       </w:pPr>
       <w:r>
         <w:rPr>
@@ -1281,8 +1257,8 @@
     </w:p>
     <w:p>
       <w:pPr>
-        <w:spacing w:line="276" w:lineRule="auto"/>
         <w:ind w:left="576" w:hanging="576"/>
+        <w:jc w:val="both"/>
       </w:pPr>
       <w:r>
         <w:rPr>
@@ -1293,8 +1269,8 @@
     </w:p>
     <w:p>
       <w:pPr>
-        <w:spacing w:line="276" w:lineRule="auto"/>
         <w:ind w:left="576" w:hanging="576"/>
+        <w:jc w:val="both"/>
       </w:pPr>
       <w:r>
         <w:rPr>
@@ -1305,8 +1281,8 @@
     </w:p>
     <w:p>
       <w:pPr>
-        <w:spacing w:line="276" w:lineRule="auto"/>
         <w:ind w:left="576" w:hanging="576"/>
+        <w:jc w:val="both"/>
       </w:pPr>
       <w:r>
         <w:rPr>
@@ -1317,8 +1293,8 @@
     </w:p>
     <w:p>
       <w:pPr>
-        <w:spacing w:line="276" w:lineRule="auto"/>
         <w:ind w:left="576" w:hanging="576"/>
+        <w:jc w:val="both"/>
       </w:pPr>
       <w:r>
         <w:rPr>
@@ -1329,8 +1305,8 @@
     </w:p>
     <w:p>
       <w:pPr>
-        <w:spacing w:line="276" w:lineRule="auto"/>
         <w:ind w:left="576" w:hanging="576"/>
+        <w:jc w:val="both"/>
       </w:pPr>
       <w:r>
         <w:rPr>
@@ -1341,8 +1317,8 @@
     </w:p>
     <w:p>
       <w:pPr>
-        <w:spacing w:line="276" w:lineRule="auto"/>
         <w:ind w:left="576" w:hanging="576"/>
+        <w:jc w:val="both"/>
       </w:pPr>
       <w:r>
         <w:rPr>
@@ -1353,8 +1329,8 @@
     </w:p>
     <w:p>
       <w:pPr>
-        <w:spacing w:line="276" w:lineRule="auto"/>
         <w:ind w:left="576" w:hanging="576"/>
+        <w:jc w:val="both"/>
       </w:pPr>
       <w:r>
         <w:rPr>
@@ -1365,8 +1341,8 @@
     </w:p>
     <w:p>
       <w:pPr>
-        <w:spacing w:line="276" w:lineRule="auto"/>
         <w:ind w:left="576" w:hanging="576"/>
+        <w:jc w:val="both"/>
       </w:pPr>
       <w:r>
         <w:rPr>
@@ -1377,8 +1353,8 @@
     </w:p>
     <w:p>
       <w:pPr>
-        <w:spacing w:line="276" w:lineRule="auto"/>
         <w:ind w:left="576" w:hanging="576"/>
+        <w:jc w:val="both"/>
       </w:pPr>
       <w:r>
         <w:rPr>
@@ -1389,8 +1365,8 @@
     </w:p>
     <w:p>
       <w:pPr>
-        <w:spacing w:line="276" w:lineRule="auto"/>
         <w:ind w:left="576" w:hanging="576"/>
+        <w:jc w:val="both"/>
       </w:pPr>
       <w:r>
         <w:rPr>
@@ -1401,8 +1377,8 @@
     </w:p>
     <w:p>
       <w:pPr>
-        <w:spacing w:line="276" w:lineRule="auto"/>
         <w:ind w:left="576" w:hanging="576"/>
+        <w:jc w:val="both"/>
       </w:pPr>
       <w:r>
         <w:rPr>
@@ -1413,8 +1389,8 @@
     </w:p>
     <w:p>
       <w:pPr>
-        <w:spacing w:line="276" w:lineRule="auto"/>
         <w:ind w:left="576" w:hanging="576"/>
+        <w:jc w:val="both"/>
       </w:pPr>
       <w:r>
         <w:rPr>
@@ -1425,8 +1401,8 @@
     </w:p>
     <w:p>
       <w:pPr>
-        <w:spacing w:line="276" w:lineRule="auto"/>
         <w:ind w:left="576" w:hanging="576"/>
+        <w:jc w:val="both"/>
       </w:pPr>
       <w:r>
         <w:rPr>
@@ -1437,8 +1413,8 @@
     </w:p>
     <w:p>
       <w:pPr>
-        <w:spacing w:line="276" w:lineRule="auto"/>
         <w:ind w:left="576" w:hanging="576"/>
+        <w:jc w:val="both"/>
       </w:pPr>
       <w:r>
         <w:rPr>
@@ -1449,8 +1425,8 @@
     </w:p>
     <w:p>
       <w:pPr>
-        <w:spacing w:line="276" w:lineRule="auto"/>
         <w:ind w:left="576" w:hanging="576"/>
+        <w:jc w:val="both"/>
       </w:pPr>
       <w:r>
         <w:rPr>
@@ -1461,8 +1437,8 @@
     </w:p>
     <w:p>
       <w:pPr>
-        <w:spacing w:line="276" w:lineRule="auto"/>
         <w:ind w:left="576" w:hanging="576"/>
+        <w:jc w:val="both"/>
       </w:pPr>
       <w:r>
         <w:rPr>
@@ -1473,8 +1449,8 @@
     </w:p>
     <w:p>
       <w:pPr>
-        <w:spacing w:line="276" w:lineRule="auto"/>
         <w:ind w:left="576" w:hanging="576"/>
+        <w:jc w:val="both"/>
       </w:pPr>
       <w:r>
         <w:rPr>
@@ -1485,8 +1461,8 @@
     </w:p>
     <w:p>
       <w:pPr>
-        <w:spacing w:line="276" w:lineRule="auto"/>
         <w:ind w:left="576" w:hanging="576"/>
+        <w:jc w:val="both"/>
       </w:pPr>
       <w:r>
         <w:rPr>
@@ -1497,8 +1473,8 @@
     </w:p>
     <w:p>
       <w:pPr>
-        <w:spacing w:line="276" w:lineRule="auto"/>
         <w:ind w:left="576" w:hanging="576"/>
+        <w:jc w:val="both"/>
       </w:pPr>
       <w:r>
         <w:rPr>
@@ -1509,8 +1485,8 @@
     </w:p>
     <w:p>
       <w:pPr>
-        <w:spacing w:line="276" w:lineRule="auto"/>
         <w:ind w:left="576" w:hanging="576"/>
+        <w:jc w:val="both"/>
       </w:pPr>
       <w:r>
         <w:rPr>
@@ -1521,8 +1497,8 @@
     </w:p>
     <w:p>
       <w:pPr>
-        <w:spacing w:line="276" w:lineRule="auto"/>
         <w:ind w:left="576" w:hanging="576"/>
+        <w:jc w:val="both"/>
       </w:pPr>
       <w:r>
         <w:rPr>
@@ -1533,8 +1509,8 @@
     </w:p>
     <w:p>
       <w:pPr>
-        <w:spacing w:line="276" w:lineRule="auto"/>
         <w:ind w:left="576" w:hanging="576"/>
+        <w:jc w:val="both"/>
       </w:pPr>
       <w:r>
         <w:rPr>
@@ -1545,8 +1521,8 @@
     </w:p>
     <w:p>
       <w:pPr>
-        <w:spacing w:line="276" w:lineRule="auto"/>
         <w:ind w:left="576" w:hanging="576"/>
+        <w:jc w:val="both"/>
       </w:pPr>
       <w:r>
         <w:rPr>
@@ -1557,8 +1533,8 @@
     </w:p>
     <w:p>
       <w:pPr>
-        <w:spacing w:line="276" w:lineRule="auto"/>
         <w:ind w:left="576" w:hanging="576"/>
+        <w:jc w:val="both"/>
       </w:pPr>
       <w:r>
         <w:rPr>
@@ -1569,36 +1545,58 @@
     </w:p>
     <w:p>
       <w:pPr>
-        <w:spacing w:line="276" w:lineRule="auto"/>
         <w:ind w:left="576" w:hanging="576"/>
+        <w:jc w:val="both"/>
       </w:pPr>
       <w:r>
         <w:rPr>
           <w:sz w:val="20"/>
         </w:rPr>
-        <w:t>Zeithaml, V.A., Berry, L.L. and Parasuraman, A. (1996) 'The Behavioral Consequences of Service Quality', Journal of Marketing, 60(2), pp. 31–46.</w:t>
+        <w:t>Zeithaml, V.A. (1996) 'The Behavioral Consequences of Service Quality', Journal of Marketing, 60(2), pp. 31–46.</w:t>
       </w:r>
     </w:p>
     <w:p>
       <w:pPr>
-        <w:spacing w:line="276" w:lineRule="auto"/>
         <w:ind w:left="576" w:hanging="576"/>
+        <w:jc w:val="both"/>
       </w:pPr>
       <w:r>
         <w:rPr>
           <w:sz w:val="20"/>
         </w:rPr>
-        <w:t>Zelie, E.M. (2023) 'Factors determining bank selection by micro- and small-sized enterprises: evidence from Ethiopia', International Journal of Bank Marketing, 41(5), pp. 1120–11242.</w:t>
+        <w:t>Zelie, E.M. (2023) 'Factors determining bank selection by micro- and small-sized enterprises: evidence from Ethiopia', International Journal of Bank Marketing, 41(5), pp. 1120–1142.</w:t>
       </w:r>
     </w:p>
     <w:sectPr>
+      <w:headerReference w:type="default" r:id="rId9"/>
       <w:pgSz w:w="12240" w:h="15840"/>
-      <w:pgMar w:top="1152" w:right="1152" w:bottom="1152" w:left="1152" w:header="720" w:footer="720" w:gutter="0"/>
+      <w:pgMar w:top="1440" w:right="1440" w:bottom="1440" w:left="1440" w:header="720" w:footer="720" w:gutter="0"/>
       <w:cols w:space="720"/>
+      <w:titlePg/>
       <w:docGrid w:linePitch="360"/>
     </w:sectPr>
   </w:body>
 </w:document>
+</file>
+
+<file path=word/header1.xml><?xml version="1.0" encoding="utf-8"?>
+<w:hdr xmlns:m="http://schemas.openxmlformats.org/officeDocument/2006/math" xmlns:mc="http://schemas.openxmlformats.org/markup-compatibility/2006" xmlns:mo="http://schemas.microsoft.com/office/mac/office/2008/main" xmlns:mv="urn:schemas-microsoft-com:mac:vml" xmlns:o="urn:schemas-microsoft-com:office:office" xmlns:r="http://schemas.openxmlformats.org/officeDocument/2006/relationships" xmlns:v="urn:schemas-microsoft-com:vml" xmlns:w10="urn:schemas-microsoft-com:office:word" xmlns:w14="http://schemas.microsoft.com/office/word/2010/wordml" xmlns:w="http://schemas.openxmlformats.org/wordprocessingml/2006/main" xmlns:wne="http://schemas.microsoft.com/office/word/2006/wordml" xmlns:wp14="http://schemas.microsoft.com/office/word/2010/wordprocessingDrawing" xmlns:wp="http://schemas.openxmlformats.org/drawingml/2006/wordprocessingDrawing" xmlns:wpc="http://schemas.microsoft.com/office/word/2010/wordprocessingCanvas" xmlns:wpg="http://schemas.microsoft.com/office/word/2010/wordprocessingGroup" xmlns:wpi="http://schemas.microsoft.com/office/word/2010/wordprocessingInk" xmlns:wps="http://schemas.microsoft.com/office/word/2010/wordprocessingShape" mc:Ignorable="w14 wp14">
+  <w:p>
+    <w:pPr>
+      <w:pStyle w:val="Header"/>
+      <w:jc w:val="center"/>
+    </w:pPr>
+    <w:r>
+      <w:rPr>
+        <w:rFonts w:ascii="Times New Roman" w:hAnsi="Times New Roman"/>
+        <w:i/>
+        <w:color w:val="666666"/>
+        <w:sz w:val="17"/>
+      </w:rPr>
+      <w:t>NATIONAL ECONOMICS UNIVERSITY FACULTY OF ECONOMICS | ERASMUS UNIVERSITY ROTTERDAM INTERNATIONAL INSTITUTE OF SOCIAL STUDIES</w:t>
+    </w:r>
+  </w:p>
+</w:hdr>
 </file>
 
 <file path=word/numbering.xml><?xml version="1.0" encoding="utf-8"?>
@@ -1964,10 +1962,13 @@
     <w:name w:val="Normal"/>
     <w:qFormat/>
     <w:rsid w:val="00FC693F"/>
+    <w:pPr>
+      <w:spacing w:line="276" w:lineRule="auto" w:after="120"/>
+    </w:pPr>
     <w:rPr>
       <w:rFonts w:ascii="Times New Roman" w:hAnsi="Times New Roman"/>
       <w:color w:val="222222"/>
-      <w:sz w:val="23"/>
+      <w:sz w:val="24"/>
     </w:rPr>
   </w:style>
   <w:style w:type="paragraph" w:styleId="Header">
@@ -2025,14 +2026,14 @@
     <w:pPr>
       <w:keepNext/>
       <w:keepLines/>
-      <w:spacing w:before="480" w:after="0"/>
+      <w:spacing w:before="280" w:after="120"/>
       <w:outlineLvl w:val="0"/>
     </w:pPr>
     <w:rPr>
-      <w:rFonts w:asciiTheme="majorHAnsi" w:eastAsiaTheme="majorEastAsia" w:hAnsiTheme="majorHAnsi" w:cstheme="majorBidi"/>
+      <w:rFonts w:asciiTheme="majorHAnsi" w:eastAsiaTheme="majorEastAsia" w:hAnsiTheme="majorHAnsi" w:cstheme="majorBidi" w:ascii="Times New Roman" w:hAnsi="Times New Roman"/>
       <w:b/>
       <w:bCs/>
-      <w:color w:val="365F91" w:themeColor="accent1" w:themeShade="BF"/>
+      <w:color w:val="003366"/>
       <w:sz w:val="28"/>
       <w:szCs w:val="28"/>
     </w:rPr>
@@ -2049,15 +2050,15 @@
     <w:pPr>
       <w:keepNext/>
       <w:keepLines/>
-      <w:spacing w:before="200" w:after="0"/>
+      <w:spacing w:before="200" w:after="80"/>
       <w:outlineLvl w:val="1"/>
     </w:pPr>
     <w:rPr>
-      <w:rFonts w:asciiTheme="majorHAnsi" w:eastAsiaTheme="majorEastAsia" w:hAnsiTheme="majorHAnsi" w:cstheme="majorBidi"/>
+      <w:rFonts w:asciiTheme="majorHAnsi" w:eastAsiaTheme="majorEastAsia" w:hAnsiTheme="majorHAnsi" w:cstheme="majorBidi" w:ascii="Times New Roman" w:hAnsi="Times New Roman"/>
       <w:b/>
       <w:bCs/>
-      <w:color w:val="4F81BD" w:themeColor="accent1"/>
-      <w:sz w:val="26"/>
+      <w:color w:val="003366"/>
+      <w:sz w:val="25"/>
       <w:szCs w:val="26"/>
     </w:rPr>
   </w:style>

</xml_diff>

<commit_message>
Update running header to exact text: Thesis Design – MDE31 – Dang Tu Linh
</commit_message>
<xml_diff>
--- a/DTL_Thesis_Design_NEU_MDE_Final.docx
+++ b/DTL_Thesis_Design_NEU_MDE_Final.docx
@@ -1584,16 +1584,19 @@
   <w:p>
     <w:pPr>
       <w:pStyle w:val="Header"/>
-      <w:jc w:val="center"/>
+      <w:jc w:val="right"/>
+      <w:pBdr>
+        <w:bottom w:val="single" w:sz="6" w:space="4" w:color="003366"/>
+      </w:pBdr>
     </w:pPr>
     <w:r>
       <w:rPr>
         <w:rFonts w:ascii="Times New Roman" w:hAnsi="Times New Roman"/>
         <w:i/>
-        <w:color w:val="666666"/>
-        <w:sz w:val="17"/>
-      </w:rPr>
-      <w:t>NATIONAL ECONOMICS UNIVERSITY FACULTY OF ECONOMICS | ERASMUS UNIVERSITY ROTTERDAM INTERNATIONAL INSTITUTE OF SOCIAL STUDIES</w:t>
+        <w:color w:val="333333"/>
+        <w:sz w:val="20"/>
+      </w:rPr>
+      <w:t>Thesis Design – MDE31 – Dang Tu Linh</w:t>
     </w:r>
   </w:p>
 </w:hdr>

</xml_diff>

<commit_message>
Fix stretched text whitespace gaps by cleanly separating list paragraphs
</commit_message>
<xml_diff>
--- a/DTL_Thesis_Design_NEU_MDE_Final.docx
+++ b/DTL_Thesis_Design_NEU_MDE_Final.docx
@@ -4,6 +4,7 @@
   <w:body>
     <w:p>
       <w:pPr>
+        <w:spacing w:after="40"/>
         <w:jc w:val="center"/>
       </w:pPr>
       <w:r>
@@ -13,11 +14,11 @@
           <w:sz w:val="26"/>
         </w:rPr>
         <w:t>VIETNAM-NETHERLANDS MASTER’S PROGRAM IN DEVELOPMENT ECONOMICS (MDE)</w:t>
-        <w:br/>
       </w:r>
     </w:p>
     <w:p>
       <w:pPr>
+        <w:spacing w:after="360"/>
         <w:jc w:val="center"/>
       </w:pPr>
       <w:r>
@@ -26,12 +27,11 @@
           <w:sz w:val="30"/>
         </w:rPr>
         <w:t>THESIS DESIGN</w:t>
-        <w:br/>
       </w:r>
     </w:p>
-    <w:p/>
     <w:p>
       <w:pPr>
+        <w:spacing w:after="720"/>
         <w:jc w:val="center"/>
       </w:pPr>
       <w:r>
@@ -43,11 +43,9 @@
         <w:t>FACTORS AFFECTING CORPORATE CUSTOMERS' DECISION TO CHOOSE BANK GUARANTEE PRODUCTS AT VIETNAM JOINT STOCK COMMERCIAL BANK FOR INDUSTRY AND TRADE (VIETINBANK)</w:t>
       </w:r>
     </w:p>
-    <w:p/>
-    <w:p/>
     <w:p>
       <w:pPr>
-        <w:spacing w:line="312" w:lineRule="auto"/>
+        <w:spacing w:after="80"/>
         <w:jc w:val="center"/>
       </w:pPr>
       <w:r>
@@ -56,17 +54,25 @@
           <w:sz w:val="24"/>
         </w:rPr>
         <w:t>Supervisor(s): Dr. Hoang Thi Thuy Nga</w:t>
-        <w:br/>
       </w:r>
+    </w:p>
+    <w:p>
+      <w:pPr>
+        <w:spacing w:after="360"/>
+        <w:jc w:val="center"/>
+      </w:pPr>
       <w:r>
         <w:rPr>
           <w:b/>
           <w:sz w:val="24"/>
         </w:rPr>
         <w:t>Student: Dang Tu Linh, MDE Class 31</w:t>
-        <w:br/>
-        <w:br/>
       </w:r>
+    </w:p>
+    <w:p>
+      <w:pPr>
+        <w:jc w:val="center"/>
+      </w:pPr>
       <w:r>
         <w:rPr>
           <w:i/>
@@ -98,6 +104,7 @@
     </w:p>
     <w:p>
       <w:pPr>
+        <w:spacing w:after="120"/>
         <w:jc w:val="both"/>
       </w:pPr>
       <w:r>
@@ -106,6 +113,7 @@
     </w:p>
     <w:p>
       <w:pPr>
+        <w:spacing w:after="120"/>
         <w:jc w:val="both"/>
       </w:pPr>
       <w:r>
@@ -114,6 +122,7 @@
     </w:p>
     <w:p>
       <w:pPr>
+        <w:spacing w:after="120"/>
         <w:jc w:val="both"/>
       </w:pPr>
       <w:r>
@@ -122,6 +131,7 @@
     </w:p>
     <w:p>
       <w:pPr>
+        <w:spacing w:after="120"/>
         <w:jc w:val="both"/>
       </w:pPr>
       <w:r>
@@ -130,6 +140,7 @@
     </w:p>
     <w:p>
       <w:pPr>
+        <w:spacing w:after="120"/>
         <w:jc w:val="both"/>
       </w:pPr>
       <w:r>
@@ -146,6 +157,7 @@
     </w:p>
     <w:p>
       <w:pPr>
+        <w:spacing w:after="120"/>
         <w:jc w:val="both"/>
       </w:pPr>
       <w:r>
@@ -161,45 +173,76 @@
       </w:r>
     </w:p>
     <w:p>
+      <w:pPr>
+        <w:spacing w:after="80"/>
+        <w:jc w:val="both"/>
+      </w:pPr>
       <w:r>
         <w:t>The following sub-questions will be investigated to answer the general objective:</w:t>
-        <w:br/>
       </w:r>
     </w:p>
     <w:p>
       <w:pPr>
-        <w:ind w:left="360"/>
+        <w:spacing w:after="80"/>
+        <w:ind w:left="432"/>
         <w:jc w:val="both"/>
       </w:pPr>
       <w:r>
-        <w:t>1. What factors affect corporate customers' decision to choose bank guarantee products at VietinBank?</w:t>
+        <w:rPr>
+          <w:b/>
+        </w:rPr>
+        <w:t xml:space="preserve">1. </w:t>
+      </w:r>
+      <w:r>
+        <w:t>What factors affect corporate customers' decision to choose bank guarantee products at VietinBank?</w:t>
       </w:r>
     </w:p>
     <w:p>
       <w:pPr>
-        <w:ind w:left="360"/>
+        <w:spacing w:after="80"/>
+        <w:ind w:left="432"/>
         <w:jc w:val="both"/>
       </w:pPr>
       <w:r>
-        <w:t>2. What is the direction and magnitude of each factor's impact on the selection decision?</w:t>
+        <w:rPr>
+          <w:b/>
+        </w:rPr>
+        <w:t xml:space="preserve">2. </w:t>
+      </w:r>
+      <w:r>
+        <w:t>What is the direction and magnitude of each factor's impact on the selection decision?</w:t>
       </w:r>
     </w:p>
     <w:p>
       <w:pPr>
-        <w:ind w:left="360"/>
+        <w:spacing w:after="80"/>
+        <w:ind w:left="432"/>
         <w:jc w:val="both"/>
       </w:pPr>
       <w:r>
-        <w:t>3. Do impact magnitudes differ across corporate subgroups categorized by ownership structure, revenue scale, operating age, and guarantee types used?</w:t>
+        <w:rPr>
+          <w:b/>
+        </w:rPr>
+        <w:t xml:space="preserve">3. </w:t>
+      </w:r>
+      <w:r>
+        <w:t>Do impact magnitudes differ across corporate subgroups categorized by ownership structure, revenue scale, operating age, and guarantee types used?</w:t>
       </w:r>
     </w:p>
     <w:p>
       <w:pPr>
-        <w:ind w:left="360"/>
+        <w:spacing w:after="80"/>
+        <w:ind w:left="432"/>
         <w:jc w:val="both"/>
       </w:pPr>
       <w:r>
-        <w:t>4. What managerial implications should VietinBank prioritize to enhance its selection probability as the preferred issuing bank?</w:t>
+        <w:rPr>
+          <w:b/>
+        </w:rPr>
+        <w:t xml:space="preserve">4. </w:t>
+      </w:r>
+      <w:r>
+        <w:t>What managerial implications should VietinBank prioritize to enhance its selection probability as the preferred issuing bank?</w:t>
       </w:r>
     </w:p>
     <w:p>
@@ -212,17 +255,50 @@
     </w:p>
     <w:p>
       <w:pPr>
+        <w:spacing w:after="80"/>
         <w:jc w:val="both"/>
       </w:pPr>
       <w:r>
         <w:t>This thesis comprises four main chapters:</w:t>
-        <w:br/>
+      </w:r>
+    </w:p>
+    <w:p>
+      <w:pPr>
+        <w:spacing w:after="80"/>
+        <w:ind w:left="432"/>
+        <w:jc w:val="both"/>
+      </w:pPr>
+      <w:r>
         <w:t>• Chapter 1: Introduction – Presents research rationales, general and specific objectives, sub-questions, and thesis structure.</w:t>
-        <w:br/>
+      </w:r>
+    </w:p>
+    <w:p>
+      <w:pPr>
+        <w:spacing w:after="80"/>
+        <w:ind w:left="432"/>
+        <w:jc w:val="both"/>
+      </w:pPr>
+      <w:r>
         <w:t>• Chapter 2: Literature Review and Theoretical Framework – Synthesizes legal and economic foundations of bank guarantees; presents theoretical frameworks (SERVQUAL, TRA/TPB, Oliver's Loyalty Model); reviews empirical studies; and identifies four research gaps underlying the proposed 10-independent-variable model.</w:t>
-        <w:br/>
+      </w:r>
+    </w:p>
+    <w:p>
+      <w:pPr>
+        <w:spacing w:after="80"/>
+        <w:ind w:left="432"/>
+        <w:jc w:val="both"/>
+      </w:pPr>
+      <w:r>
         <w:t>• Chapter 3: Research Methodology and Empirical Design – Presents the multiple linear regression model and 10 hypotheses; constructs the 5-point Likert scale with 37 items; describes data sources from VietinBank's existing corporate survey dataset; and details SPSS statistical procedures.</w:t>
-        <w:br/>
+      </w:r>
+    </w:p>
+    <w:p>
+      <w:pPr>
+        <w:spacing w:after="160"/>
+        <w:ind w:left="432"/>
+        <w:jc w:val="both"/>
+      </w:pPr>
+      <w:r>
         <w:t>• Chapter 4: Empirical Results, Discussion and Policy Recommendations – Reports descriptive statistics, reliability tests, EFA, and regression results; discusses findings; and details managerial recommendations for VietinBank.</w:t>
       </w:r>
     </w:p>
@@ -244,6 +320,7 @@
     </w:p>
     <w:p>
       <w:pPr>
+        <w:spacing w:after="120"/>
         <w:jc w:val="both"/>
       </w:pPr>
       <w:r>
@@ -252,6 +329,7 @@
     </w:p>
     <w:p>
       <w:pPr>
+        <w:spacing w:after="120"/>
         <w:jc w:val="both"/>
       </w:pPr>
       <w:r>
@@ -260,16 +338,59 @@
     </w:p>
     <w:p>
       <w:pPr>
+        <w:spacing w:after="80"/>
         <w:jc w:val="both"/>
       </w:pPr>
       <w:r>
         <w:t>Corporate bank selection represents organizational buying behavior explained by three integrated theoretical models:</w:t>
-        <w:br/>
-        <w:t>1. Theory of Reasoned Action (TRA, Fishbein &amp; Ajzen, 1975) &amp; Theory of Planned Behavior (TPB, Ajzen, 1991): Establishes that beliefs regarding service attributes form attitudes and perceived behavioral control, driving selection intention.</w:t>
-        <w:br/>
-        <w:t>2. SERVQUAL Model (Parasuraman, Zeithaml &amp; Berry, 1985, 1988): Maps service quality dimensions—Reliability, Responsiveness, Assurance, Empathy, and Tangibles—to bank guarantee attributes (SPE, STA, REP, CUS, DIG).</w:t>
-        <w:br/>
-        <w:t>3. Customer Perceived Value (Zeithaml, 1988) &amp; Oliver's 4-Stage Loyalty Model (1999) / Zeithaml et al. (1996): Ground the price dimension (COST) and operationalize the dependent variable (DEC) across Cognitive, Affective, Conative, and Action dimensions (DEC1–DEC4).</w:t>
+      </w:r>
+    </w:p>
+    <w:p>
+      <w:pPr>
+        <w:spacing w:after="80"/>
+        <w:ind w:left="432"/>
+        <w:jc w:val="both"/>
+      </w:pPr>
+      <w:r>
+        <w:rPr>
+          <w:b/>
+        </w:rPr>
+        <w:t xml:space="preserve">1. </w:t>
+      </w:r>
+      <w:r>
+        <w:t>Theory of Reasoned Action (TRA, Fishbein &amp; Ajzen, 1975) &amp; Theory of Planned Behavior (TPB, Ajzen, 1991): Establishes that beliefs regarding service attributes form attitudes and perceived behavioral control, driving selection intention.</w:t>
+      </w:r>
+    </w:p>
+    <w:p>
+      <w:pPr>
+        <w:spacing w:after="80"/>
+        <w:ind w:left="432"/>
+        <w:jc w:val="both"/>
+      </w:pPr>
+      <w:r>
+        <w:rPr>
+          <w:b/>
+        </w:rPr>
+        <w:t xml:space="preserve">2. </w:t>
+      </w:r>
+      <w:r>
+        <w:t>SERVQUAL Model (Parasuraman, Zeithaml &amp; Berry, 1985, 1988): Maps service quality dimensions—Reliability, Responsiveness, Assurance, Empathy, and Tangibles—to bank guarantee attributes (SPE, STA, REP, CUS, DIG).</w:t>
+      </w:r>
+    </w:p>
+    <w:p>
+      <w:pPr>
+        <w:spacing w:after="160"/>
+        <w:ind w:left="432"/>
+        <w:jc w:val="both"/>
+      </w:pPr>
+      <w:r>
+        <w:rPr>
+          <w:b/>
+        </w:rPr>
+        <w:t xml:space="preserve">3. </w:t>
+      </w:r>
+      <w:r>
+        <w:t>Customer Perceived Value (Zeithaml, 1988) &amp; Oliver's 4-Stage Loyalty Model (1999) / Zeithaml et al. (1996): Ground the price dimension (COST) and operationalize the dependent variable (DEC) across Cognitive, Affective, Conative, and Action dimensions (DEC1–DEC4).</w:t>
       </w:r>
     </w:p>
     <w:p>
@@ -282,6 +403,7 @@
     </w:p>
     <w:p>
       <w:pPr>
+        <w:spacing w:after="120"/>
         <w:jc w:val="both"/>
       </w:pPr>
       <w:r>
@@ -306,6 +428,7 @@
     </w:p>
     <w:p>
       <w:pPr>
+        <w:spacing w:after="120"/>
         <w:jc w:val="both"/>
       </w:pPr>
       <w:r>
@@ -314,6 +437,7 @@
     </w:p>
     <w:p>
       <w:pPr>
+        <w:spacing w:after="200"/>
         <w:jc w:val="center"/>
       </w:pPr>
       <w:r>
@@ -324,8 +448,10 @@
         <w:t>DEC = β0 + β1*COST + β2*COL + β3*SPE + β4*REP + β5*STA + β6*REL + β7*DIG + β8*CUS + β9*RSK + β10*NET + ε                             (1)</w:t>
       </w:r>
     </w:p>
-    <w:p/>
     <w:p>
+      <w:pPr>
+        <w:spacing w:after="80"/>
+      </w:pPr>
       <w:r>
         <w:rPr>
           <w:b/>
@@ -1193,6 +1319,7 @@
     </w:p>
     <w:p>
       <w:pPr>
+        <w:spacing w:after="120"/>
         <w:jc w:val="both"/>
       </w:pPr>
       <w:r>
@@ -1209,13 +1336,30 @@
     </w:p>
     <w:p>
       <w:pPr>
+        <w:spacing w:after="80"/>
         <w:jc w:val="both"/>
       </w:pPr>
       <w:r>
         <w:t>Based on theoretical frameworks and banking context, the following results are anticipated:</w:t>
-        <w:br/>
+      </w:r>
+    </w:p>
+    <w:p>
+      <w:pPr>
+        <w:spacing w:after="80"/>
+        <w:ind w:left="432"/>
+        <w:jc w:val="both"/>
+      </w:pPr>
+      <w:r>
         <w:t>• COST (X1) is expected to exert a statistically significant negative impact (β1 &lt; 0), confirming price sensitivity.</w:t>
-        <w:br/>
+      </w:r>
+    </w:p>
+    <w:p>
+      <w:pPr>
+        <w:spacing w:after="160"/>
+        <w:ind w:left="432"/>
+        <w:jc w:val="both"/>
+      </w:pPr>
+      <w:r>
         <w:t>• All positive-dimension attributes (X2 to X10) are expected to yield positive coefficients (β2 to β10 &gt; 0). Digitalisation (DIG) and Processing Speed (SPE) are projected to emerge among the strongest determinants, reflecting corporate urgency in tender deadlines. Customisation (CUS) and Legal Risk Advisory (RSK) will validate the strategic value of tailored banking solutions.</w:t>
       </w:r>
     </w:p>
@@ -1229,6 +1373,7 @@
     </w:p>
     <w:p>
       <w:pPr>
+        <w:spacing w:after="120"/>
         <w:jc w:val="both"/>
       </w:pPr>
       <w:r>
@@ -1245,6 +1390,7 @@
     </w:p>
     <w:p>
       <w:pPr>
+        <w:spacing w:after="80"/>
         <w:ind w:left="576" w:hanging="576"/>
         <w:jc w:val="both"/>
       </w:pPr>
@@ -1257,6 +1403,7 @@
     </w:p>
     <w:p>
       <w:pPr>
+        <w:spacing w:after="80"/>
         <w:ind w:left="576" w:hanging="576"/>
         <w:jc w:val="both"/>
       </w:pPr>
@@ -1269,6 +1416,7 @@
     </w:p>
     <w:p>
       <w:pPr>
+        <w:spacing w:after="80"/>
         <w:ind w:left="576" w:hanging="576"/>
         <w:jc w:val="both"/>
       </w:pPr>
@@ -1281,6 +1429,7 @@
     </w:p>
     <w:p>
       <w:pPr>
+        <w:spacing w:after="80"/>
         <w:ind w:left="576" w:hanging="576"/>
         <w:jc w:val="both"/>
       </w:pPr>
@@ -1293,6 +1442,7 @@
     </w:p>
     <w:p>
       <w:pPr>
+        <w:spacing w:after="80"/>
         <w:ind w:left="576" w:hanging="576"/>
         <w:jc w:val="both"/>
       </w:pPr>
@@ -1305,6 +1455,7 @@
     </w:p>
     <w:p>
       <w:pPr>
+        <w:spacing w:after="80"/>
         <w:ind w:left="576" w:hanging="576"/>
         <w:jc w:val="both"/>
       </w:pPr>
@@ -1317,6 +1468,7 @@
     </w:p>
     <w:p>
       <w:pPr>
+        <w:spacing w:after="80"/>
         <w:ind w:left="576" w:hanging="576"/>
         <w:jc w:val="both"/>
       </w:pPr>
@@ -1329,6 +1481,7 @@
     </w:p>
     <w:p>
       <w:pPr>
+        <w:spacing w:after="80"/>
         <w:ind w:left="576" w:hanging="576"/>
         <w:jc w:val="both"/>
       </w:pPr>
@@ -1341,6 +1494,7 @@
     </w:p>
     <w:p>
       <w:pPr>
+        <w:spacing w:after="80"/>
         <w:ind w:left="576" w:hanging="576"/>
         <w:jc w:val="both"/>
       </w:pPr>
@@ -1353,6 +1507,7 @@
     </w:p>
     <w:p>
       <w:pPr>
+        <w:spacing w:after="80"/>
         <w:ind w:left="576" w:hanging="576"/>
         <w:jc w:val="both"/>
       </w:pPr>
@@ -1365,6 +1520,7 @@
     </w:p>
     <w:p>
       <w:pPr>
+        <w:spacing w:after="80"/>
         <w:ind w:left="576" w:hanging="576"/>
         <w:jc w:val="both"/>
       </w:pPr>
@@ -1377,6 +1533,7 @@
     </w:p>
     <w:p>
       <w:pPr>
+        <w:spacing w:after="80"/>
         <w:ind w:left="576" w:hanging="576"/>
         <w:jc w:val="both"/>
       </w:pPr>
@@ -1389,6 +1546,7 @@
     </w:p>
     <w:p>
       <w:pPr>
+        <w:spacing w:after="80"/>
         <w:ind w:left="576" w:hanging="576"/>
         <w:jc w:val="both"/>
       </w:pPr>
@@ -1401,6 +1559,7 @@
     </w:p>
     <w:p>
       <w:pPr>
+        <w:spacing w:after="80"/>
         <w:ind w:left="576" w:hanging="576"/>
         <w:jc w:val="both"/>
       </w:pPr>
@@ -1413,6 +1572,7 @@
     </w:p>
     <w:p>
       <w:pPr>
+        <w:spacing w:after="80"/>
         <w:ind w:left="576" w:hanging="576"/>
         <w:jc w:val="both"/>
       </w:pPr>
@@ -1425,6 +1585,7 @@
     </w:p>
     <w:p>
       <w:pPr>
+        <w:spacing w:after="80"/>
         <w:ind w:left="576" w:hanging="576"/>
         <w:jc w:val="both"/>
       </w:pPr>
@@ -1437,6 +1598,7 @@
     </w:p>
     <w:p>
       <w:pPr>
+        <w:spacing w:after="80"/>
         <w:ind w:left="576" w:hanging="576"/>
         <w:jc w:val="both"/>
       </w:pPr>
@@ -1449,6 +1611,7 @@
     </w:p>
     <w:p>
       <w:pPr>
+        <w:spacing w:after="80"/>
         <w:ind w:left="576" w:hanging="576"/>
         <w:jc w:val="both"/>
       </w:pPr>
@@ -1461,6 +1624,7 @@
     </w:p>
     <w:p>
       <w:pPr>
+        <w:spacing w:after="80"/>
         <w:ind w:left="576" w:hanging="576"/>
         <w:jc w:val="both"/>
       </w:pPr>
@@ -1473,6 +1637,7 @@
     </w:p>
     <w:p>
       <w:pPr>
+        <w:spacing w:after="80"/>
         <w:ind w:left="576" w:hanging="576"/>
         <w:jc w:val="both"/>
       </w:pPr>
@@ -1485,6 +1650,7 @@
     </w:p>
     <w:p>
       <w:pPr>
+        <w:spacing w:after="80"/>
         <w:ind w:left="576" w:hanging="576"/>
         <w:jc w:val="both"/>
       </w:pPr>
@@ -1497,6 +1663,7 @@
     </w:p>
     <w:p>
       <w:pPr>
+        <w:spacing w:after="80"/>
         <w:ind w:left="576" w:hanging="576"/>
         <w:jc w:val="both"/>
       </w:pPr>
@@ -1509,6 +1676,7 @@
     </w:p>
     <w:p>
       <w:pPr>
+        <w:spacing w:after="80"/>
         <w:ind w:left="576" w:hanging="576"/>
         <w:jc w:val="both"/>
       </w:pPr>
@@ -1521,6 +1689,7 @@
     </w:p>
     <w:p>
       <w:pPr>
+        <w:spacing w:after="80"/>
         <w:ind w:left="576" w:hanging="576"/>
         <w:jc w:val="both"/>
       </w:pPr>
@@ -1533,6 +1702,7 @@
     </w:p>
     <w:p>
       <w:pPr>
+        <w:spacing w:after="80"/>
         <w:ind w:left="576" w:hanging="576"/>
         <w:jc w:val="both"/>
       </w:pPr>
@@ -1545,6 +1715,7 @@
     </w:p>
     <w:p>
       <w:pPr>
+        <w:spacing w:after="80"/>
         <w:ind w:left="576" w:hanging="576"/>
         <w:jc w:val="both"/>
       </w:pPr>
@@ -1557,6 +1728,7 @@
     </w:p>
     <w:p>
       <w:pPr>
+        <w:spacing w:after="80"/>
         <w:ind w:left="576" w:hanging="576"/>
         <w:jc w:val="both"/>
       </w:pPr>

</xml_diff>

<commit_message>
Fix Section V References alignment to clean straight LEFT alignment
</commit_message>
<xml_diff>
--- a/DTL_Thesis_Design_NEU_MDE_Final.docx
+++ b/DTL_Thesis_Design_NEU_MDE_Final.docx
@@ -1390,351 +1390,351 @@
     </w:p>
     <w:p>
       <w:pPr>
-        <w:spacing w:after="80"/>
-        <w:ind w:left="576" w:hanging="576"/>
-        <w:jc w:val="both"/>
+        <w:spacing w:after="120"/>
+        <w:ind w:left="0" w:firstLine="0"/>
+        <w:jc w:val="left"/>
       </w:pPr>
       <w:r>
         <w:rPr>
-          <w:sz w:val="20"/>
+          <w:sz w:val="21"/>
         </w:rPr>
         <w:t>Ajzen, I. (1991) 'The Theory of Planned Behavior', Organizational Behavior and Human Decision Processes, 50(2), pp. 179–211.</w:t>
       </w:r>
     </w:p>
     <w:p>
       <w:pPr>
-        <w:spacing w:after="80"/>
-        <w:ind w:left="576" w:hanging="576"/>
-        <w:jc w:val="both"/>
+        <w:spacing w:after="120"/>
+        <w:ind w:left="0" w:firstLine="0"/>
+        <w:jc w:val="left"/>
       </w:pPr>
       <w:r>
         <w:rPr>
-          <w:sz w:val="20"/>
+          <w:sz w:val="21"/>
         </w:rPr>
         <w:t>Al-Sabbagh, M. and Al-Khathlan, K. (2018) 'Factors influencing corporate clients’ choice of commercial banks for trade finance services', Journal of Financial Services Marketing, 23(2), pp. 71–82.</w:t>
       </w:r>
     </w:p>
     <w:p>
       <w:pPr>
-        <w:spacing w:after="80"/>
-        <w:ind w:left="576" w:hanging="576"/>
-        <w:jc w:val="both"/>
+        <w:spacing w:after="120"/>
+        <w:ind w:left="0" w:firstLine="0"/>
+        <w:jc w:val="left"/>
       </w:pPr>
       <w:r>
         <w:rPr>
-          <w:sz w:val="20"/>
+          <w:sz w:val="21"/>
         </w:rPr>
         <w:t>Baltagi, B.H. (2008) Econometric Analysis of Panel Data. 4th edn. Chichester: Wiley.</w:t>
       </w:r>
     </w:p>
     <w:p>
       <w:pPr>
-        <w:spacing w:after="80"/>
-        <w:ind w:left="576" w:hanging="576"/>
-        <w:jc w:val="both"/>
+        <w:spacing w:after="120"/>
+        <w:ind w:left="0" w:firstLine="0"/>
+        <w:jc w:val="left"/>
       </w:pPr>
       <w:r>
         <w:rPr>
-          <w:sz w:val="20"/>
+          <w:sz w:val="21"/>
         </w:rPr>
         <w:t>Barru, D.J. (2005) 'How to Guarantee Contractor Performance on International Construction Projects: Comparing Surety Bonds with Bank Guarantees and Standby Letters of Credit', The George Washington International Law Review, 37(1), pp. 51–94.</w:t>
       </w:r>
     </w:p>
     <w:p>
       <w:pPr>
-        <w:spacing w:after="80"/>
-        <w:ind w:left="576" w:hanging="576"/>
-        <w:jc w:val="both"/>
+        <w:spacing w:after="120"/>
+        <w:ind w:left="0" w:firstLine="0"/>
+        <w:jc w:val="left"/>
       </w:pPr>
       <w:r>
         <w:rPr>
-          <w:sz w:val="20"/>
+          <w:sz w:val="21"/>
         </w:rPr>
         <w:t>Bertrams, R.I.V.F. (2013) Bank Guarantees in International Trade. 4th edn. The Hague: Kluwer Law International.</w:t>
       </w:r>
     </w:p>
     <w:p>
       <w:pPr>
-        <w:spacing w:after="80"/>
-        <w:ind w:left="576" w:hanging="576"/>
-        <w:jc w:val="both"/>
+        <w:spacing w:after="120"/>
+        <w:ind w:left="0" w:firstLine="0"/>
+        <w:jc w:val="left"/>
       </w:pPr>
       <w:r>
         <w:rPr>
-          <w:sz w:val="20"/>
+          <w:sz w:val="21"/>
         </w:rPr>
         <w:t>Carletti, E., Leonello, A. and Marquez, R. (2023) 'Loan guarantees, bank underwriting policies and financial fragility', Journal of Financial Economics, 149(2), pp. 260–295.</w:t>
       </w:r>
     </w:p>
     <w:p>
       <w:pPr>
-        <w:spacing w:after="80"/>
-        <w:ind w:left="576" w:hanging="576"/>
-        <w:jc w:val="both"/>
+        <w:spacing w:after="120"/>
+        <w:ind w:left="0" w:firstLine="0"/>
+        <w:jc w:val="left"/>
       </w:pPr>
       <w:r>
         <w:rPr>
-          <w:sz w:val="20"/>
+          <w:sz w:val="21"/>
         </w:rPr>
         <w:t>Fishbein, M. and Ajzen, I. (1975) Belief, Attitude, Intention and Behavior: An Introduction to Theory and Research. Reading, MA: Addison-Wesley.</w:t>
       </w:r>
     </w:p>
     <w:p>
       <w:pPr>
-        <w:spacing w:after="80"/>
-        <w:ind w:left="576" w:hanging="576"/>
-        <w:jc w:val="both"/>
+        <w:spacing w:after="120"/>
+        <w:ind w:left="0" w:firstLine="0"/>
+        <w:jc w:val="left"/>
       </w:pPr>
       <w:r>
         <w:rPr>
-          <w:sz w:val="20"/>
+          <w:sz w:val="21"/>
         </w:rPr>
         <w:t>Hassan, A.A. et al. (2018) 'The problems and abuse of performance bond in the construction industry', IOP Conference Series: Earth and Environmental Science, 143, p. 012045.</w:t>
       </w:r>
     </w:p>
     <w:p>
       <w:pPr>
-        <w:spacing w:after="80"/>
-        <w:ind w:left="576" w:hanging="576"/>
-        <w:jc w:val="both"/>
+        <w:spacing w:after="120"/>
+        <w:ind w:left="0" w:firstLine="0"/>
+        <w:jc w:val="left"/>
       </w:pPr>
       <w:r>
         <w:rPr>
-          <w:sz w:val="20"/>
+          <w:sz w:val="21"/>
         </w:rPr>
         <w:t>Ho Dinh Phi et al. (2023) 'Effect of Service Quality on Customer Loyalty: the Mediation of Customer Satisfaction, and Corporate Reputation in Banking Industry', Eurasian Journal of Business and Management, 11(3), pp. 145–160.</w:t>
       </w:r>
     </w:p>
     <w:p>
       <w:pPr>
-        <w:spacing w:after="80"/>
-        <w:ind w:left="576" w:hanging="576"/>
-        <w:jc w:val="both"/>
+        <w:spacing w:after="120"/>
+        <w:ind w:left="0" w:firstLine="0"/>
+        <w:jc w:val="left"/>
       </w:pPr>
       <w:r>
         <w:rPr>
-          <w:sz w:val="20"/>
+          <w:sz w:val="21"/>
         </w:rPr>
         <w:t>International Chamber of Commerce (2010) Uniform Rules for Demand Guarantees (URDG 758). ICC Publication No. 758. Paris: ICC.</w:t>
       </w:r>
     </w:p>
     <w:p>
       <w:pPr>
-        <w:spacing w:after="80"/>
-        <w:ind w:left="576" w:hanging="576"/>
-        <w:jc w:val="both"/>
+        <w:spacing w:after="120"/>
+        <w:ind w:left="0" w:firstLine="0"/>
+        <w:jc w:val="left"/>
       </w:pPr>
       <w:r>
         <w:rPr>
-          <w:sz w:val="20"/>
+          <w:sz w:val="21"/>
         </w:rPr>
         <w:t>Kaur, M. (2015) 'Bank Selection Process and Market Segmentation: Evidence from Indian Exporting SMEs', Vision: The Journal of Business Perspective, 19(3), pp. 214–226.</w:t>
       </w:r>
     </w:p>
     <w:p>
       <w:pPr>
-        <w:spacing w:after="80"/>
-        <w:ind w:left="576" w:hanging="576"/>
-        <w:jc w:val="both"/>
+        <w:spacing w:after="120"/>
+        <w:ind w:left="0" w:firstLine="0"/>
+        <w:jc w:val="left"/>
       </w:pPr>
       <w:r>
         <w:rPr>
-          <w:sz w:val="20"/>
+          <w:sz w:val="21"/>
         </w:rPr>
         <w:t>Kaur, M. et al. (2021) 'The determinants of bank selection criteria of SMEs: a fuzzy analytic hierarchy approach', Journal of Science and Technology Policy Management, 12(4), pp. 580–605.</w:t>
       </w:r>
     </w:p>
     <w:p>
       <w:pPr>
-        <w:spacing w:after="80"/>
-        <w:ind w:left="576" w:hanging="576"/>
-        <w:jc w:val="both"/>
+        <w:spacing w:after="120"/>
+        <w:ind w:left="0" w:firstLine="0"/>
+        <w:jc w:val="left"/>
       </w:pPr>
       <w:r>
         <w:rPr>
-          <w:sz w:val="20"/>
+          <w:sz w:val="21"/>
         </w:rPr>
         <w:t>Le Van Dung (2021) 'The nature of payment guarantee relationships at credit institutions', Industry and Trade Magazine, 8(April), pp. 45–52.</w:t>
       </w:r>
     </w:p>
     <w:p>
       <w:pPr>
-        <w:spacing w:after="80"/>
-        <w:ind w:left="576" w:hanging="576"/>
-        <w:jc w:val="both"/>
+        <w:spacing w:after="120"/>
+        <w:ind w:left="0" w:firstLine="0"/>
+        <w:jc w:val="left"/>
       </w:pPr>
       <w:r>
         <w:rPr>
-          <w:sz w:val="20"/>
+          <w:sz w:val="21"/>
         </w:rPr>
         <w:t>Narteh, B. (2013) 'SME bank selection and patronage behaviour in the Ghanaian banking industry', Management Research Review, 36(11), pp. 1061–1080.</w:t>
       </w:r>
     </w:p>
     <w:p>
       <w:pPr>
-        <w:spacing w:after="80"/>
-        <w:ind w:left="576" w:hanging="576"/>
-        <w:jc w:val="both"/>
+        <w:spacing w:after="120"/>
+        <w:ind w:left="0" w:firstLine="0"/>
+        <w:jc w:val="left"/>
       </w:pPr>
       <w:r>
         <w:rPr>
-          <w:sz w:val="20"/>
+          <w:sz w:val="21"/>
         </w:rPr>
         <w:t>Ngo, M.V. and Nguyen, H.H. (2016) 'The Relationship between Service Quality, Customer Satisfaction and Customer Loyalty: An Investigation in Vietnamese Retail Banking Sector', Journal of Competitiveness, 8(2), pp. 103–116.</w:t>
       </w:r>
     </w:p>
     <w:p>
       <w:pPr>
-        <w:spacing w:after="80"/>
-        <w:ind w:left="576" w:hanging="576"/>
-        <w:jc w:val="both"/>
+        <w:spacing w:after="120"/>
+        <w:ind w:left="0" w:firstLine="0"/>
+        <w:jc w:val="left"/>
       </w:pPr>
       <w:r>
         <w:rPr>
-          <w:sz w:val="20"/>
+          <w:sz w:val="21"/>
         </w:rPr>
         <w:t>Nguyen, H. et al. (2024) 'The impact of service innovation on customer satisfaction and customer loyalty: a case in Vietnamese retail banks', Future Business Journal, 10(1), p. 14.</w:t>
       </w:r>
     </w:p>
     <w:p>
       <w:pPr>
-        <w:spacing w:after="80"/>
-        <w:ind w:left="576" w:hanging="576"/>
-        <w:jc w:val="both"/>
+        <w:spacing w:after="120"/>
+        <w:ind w:left="0" w:firstLine="0"/>
+        <w:jc w:val="left"/>
       </w:pPr>
       <w:r>
         <w:rPr>
-          <w:sz w:val="20"/>
+          <w:sz w:val="21"/>
         </w:rPr>
         <w:t>Nguyen Thi Nhung and Nguyen Duy Phu (2015) 'Payment guarantees at Vietnamese commercial banks', Development and Integration Magazine, 25(35), pp. 62–67.</w:t>
       </w:r>
     </w:p>
     <w:p>
       <w:pPr>
-        <w:spacing w:after="80"/>
-        <w:ind w:left="576" w:hanging="576"/>
-        <w:jc w:val="both"/>
+        <w:spacing w:after="120"/>
+        <w:ind w:left="0" w:firstLine="0"/>
+        <w:jc w:val="left"/>
       </w:pPr>
       <w:r>
         <w:rPr>
-          <w:sz w:val="20"/>
+          <w:sz w:val="21"/>
         </w:rPr>
         <w:t>Oke, A.E. (2018) 'Bonding capability of Nigerian contracting firms', Engineering, Construction and Architectural Management, 25(8), pp. 1012–1024.</w:t>
       </w:r>
     </w:p>
     <w:p>
       <w:pPr>
-        <w:spacing w:after="80"/>
-        <w:ind w:left="576" w:hanging="576"/>
-        <w:jc w:val="both"/>
+        <w:spacing w:after="120"/>
+        <w:ind w:left="0" w:firstLine="0"/>
+        <w:jc w:val="left"/>
       </w:pPr>
       <w:r>
         <w:rPr>
-          <w:sz w:val="20"/>
+          <w:sz w:val="21"/>
         </w:rPr>
         <w:t>Oliver, R.L. (1999) 'Whence Consumer Loyalty?', Journal of Marketing, 63(Special Issue), pp. 33–44.</w:t>
       </w:r>
     </w:p>
     <w:p>
       <w:pPr>
-        <w:spacing w:after="80"/>
-        <w:ind w:left="576" w:hanging="576"/>
-        <w:jc w:val="both"/>
+        <w:spacing w:after="120"/>
+        <w:ind w:left="0" w:firstLine="0"/>
+        <w:jc w:val="left"/>
       </w:pPr>
       <w:r>
         <w:rPr>
-          <w:sz w:val="20"/>
+          <w:sz w:val="21"/>
         </w:rPr>
         <w:t>Parasuraman, A., Zeithaml, V.A. and Berry, L.L. (1985) 'A Conceptual Model of Service Quality and Its Implications for Future Research', Journal of Marketing, 49(4), pp. 41–50.</w:t>
       </w:r>
     </w:p>
     <w:p>
       <w:pPr>
-        <w:spacing w:after="80"/>
-        <w:ind w:left="576" w:hanging="576"/>
-        <w:jc w:val="both"/>
+        <w:spacing w:after="120"/>
+        <w:ind w:left="0" w:firstLine="0"/>
+        <w:jc w:val="left"/>
       </w:pPr>
       <w:r>
         <w:rPr>
-          <w:sz w:val="20"/>
+          <w:sz w:val="21"/>
         </w:rPr>
         <w:t>Parasuraman, A., Zeithaml, V.A. and Berry, L.L. (1988) 'SERVQUAL: A Multiple-Item Scale for Measuring Consumer Perceptions of Service Quality', Journal of Retailing, 64(1), pp. 12–40.</w:t>
       </w:r>
     </w:p>
     <w:p>
       <w:pPr>
-        <w:spacing w:after="80"/>
-        <w:ind w:left="576" w:hanging="576"/>
-        <w:jc w:val="both"/>
+        <w:spacing w:after="120"/>
+        <w:ind w:left="0" w:firstLine="0"/>
+        <w:jc w:val="left"/>
       </w:pPr>
       <w:r>
         <w:rPr>
-          <w:sz w:val="20"/>
+          <w:sz w:val="21"/>
         </w:rPr>
         <w:t>Phan Thi Hang Nga et al. (2024) 'Service quality, customer satisfaction and loyalty: a case study in Vietnamese SMEs', Cogent Business &amp; Management, 11(1), p. 2304512.</w:t>
       </w:r>
     </w:p>
     <w:p>
       <w:pPr>
-        <w:spacing w:after="80"/>
-        <w:ind w:left="576" w:hanging="576"/>
-        <w:jc w:val="both"/>
+        <w:spacing w:after="120"/>
+        <w:ind w:left="0" w:firstLine="0"/>
+        <w:jc w:val="left"/>
       </w:pPr>
       <w:r>
         <w:rPr>
-          <w:sz w:val="20"/>
+          <w:sz w:val="21"/>
         </w:rPr>
         <w:t>State Bank of Vietnam (2024) Circular No. 61/2024/TT-NHNN dated December 31, 2024, providing regulations on bank guarantees (effective April 1, 2025). Hanoi: SBV.</w:t>
       </w:r>
     </w:p>
     <w:p>
       <w:pPr>
-        <w:spacing w:after="80"/>
-        <w:ind w:left="576" w:hanging="576"/>
-        <w:jc w:val="both"/>
+        <w:spacing w:after="120"/>
+        <w:ind w:left="0" w:firstLine="0"/>
+        <w:jc w:val="left"/>
       </w:pPr>
       <w:r>
         <w:rPr>
-          <w:sz w:val="20"/>
+          <w:sz w:val="21"/>
         </w:rPr>
         <w:t>Turnbull, P.W. and Gibbs, M.L. (1989) 'The Selection of Banks and Banking Services among Corporate Customers in South Africa', International Journal of Bank Marketing, 7(5), pp. 36–42.</w:t>
       </w:r>
     </w:p>
     <w:p>
       <w:pPr>
-        <w:spacing w:after="80"/>
-        <w:ind w:left="576" w:hanging="576"/>
-        <w:jc w:val="both"/>
+        <w:spacing w:after="120"/>
+        <w:ind w:left="0" w:firstLine="0"/>
+        <w:jc w:val="left"/>
       </w:pPr>
       <w:r>
         <w:rPr>
-          <w:sz w:val="20"/>
+          <w:sz w:val="21"/>
         </w:rPr>
         <w:t>Zeithaml, V.A. (1988) 'Consumer Perceptions of Price, Quality, and Value: A Means-End Model and Synthesis of Evidence', Journal of Marketing, 52(3), pp. 2–22.</w:t>
       </w:r>
     </w:p>
     <w:p>
       <w:pPr>
-        <w:spacing w:after="80"/>
-        <w:ind w:left="576" w:hanging="576"/>
-        <w:jc w:val="both"/>
+        <w:spacing w:after="120"/>
+        <w:ind w:left="0" w:firstLine="0"/>
+        <w:jc w:val="left"/>
       </w:pPr>
       <w:r>
         <w:rPr>
-          <w:sz w:val="20"/>
+          <w:sz w:val="21"/>
         </w:rPr>
         <w:t>Zeithaml, V.A. (1996) 'The Behavioral Consequences of Service Quality', Journal of Marketing, 60(2), pp. 31–46.</w:t>
       </w:r>
     </w:p>
     <w:p>
       <w:pPr>
-        <w:spacing w:after="80"/>
-        <w:ind w:left="576" w:hanging="576"/>
-        <w:jc w:val="both"/>
+        <w:spacing w:after="120"/>
+        <w:ind w:left="0" w:firstLine="0"/>
+        <w:jc w:val="left"/>
       </w:pPr>
       <w:r>
         <w:rPr>
-          <w:sz w:val="20"/>
+          <w:sz w:val="21"/>
         </w:rPr>
         <w:t>Zelie, E.M. (2023) 'Factors determining bank selection by micro- and small-sized enterprises: evidence from Ethiopia', International Journal of Bank Marketing, 41(5), pp. 1120–1142.</w:t>
       </w:r>

</xml_diff>

<commit_message>
Add table source line in gray italic text below Table 1
</commit_message>
<xml_diff>
--- a/DTL_Thesis_Design_NEU_MDE_Final.docx
+++ b/DTL_Thesis_Design_NEU_MDE_Final.docx
@@ -1311,6 +1311,21 @@
     </w:tbl>
     <w:p>
       <w:pPr>
+        <w:spacing w:before="80" w:after="240"/>
+        <w:jc w:val="left"/>
+      </w:pPr>
+      <w:r>
+        <w:rPr>
+          <w:rFonts w:ascii="Times New Roman" w:hAnsi="Times New Roman"/>
+          <w:i/>
+          <w:color w:val="666666"/>
+          <w:sz w:val="19"/>
+        </w:rPr>
+        <w:t>Source: Author's design based on reference thesis and literature.</w:t>
+      </w:r>
+    </w:p>
+    <w:p>
+      <w:pPr>
         <w:pStyle w:val="Heading2"/>
       </w:pPr>
       <w:r>

</xml_diff>

<commit_message>
Set sample size to exactly n=800 and change processing tool from SPSS to Python
</commit_message>
<xml_diff>
--- a/DTL_Thesis_Design_NEU_MDE_Final.docx
+++ b/DTL_Thesis_Design_NEU_MDE_Final.docx
@@ -289,7 +289,7 @@
         <w:jc w:val="both"/>
       </w:pPr>
       <w:r>
-        <w:t>• Chapter 3: Research Methodology and Empirical Design – Presents the multiple linear regression model and 10 hypotheses; constructs the 5-point Likert scale with 37 items; describes data sources from VietinBank's existing corporate survey dataset; and details SPSS statistical procedures.</w:t>
+        <w:t>• Chapter 3: Research Methodology and Empirical Design – Presents the multiple linear regression model and 10 hypotheses; constructs the 5-point Likert scale with 37 items; describes data sources from VietinBank's existing corporate survey dataset; and details Python statistical procedures.</w:t>
       </w:r>
     </w:p>
     <w:p>
@@ -1338,7 +1338,7 @@
         <w:jc w:val="both"/>
       </w:pPr>
       <w:r>
-        <w:t>Rather than administering a new small-scale survey, this study inherits an existing system-wide corporate survey dataset conducted by VietinBank across its corporate client base nationwide. The sampling frame covers corporate enterprises actively utilizing guarantee services across 155 VietinBank branches. The target dataset comprises n = 800 to n = 10,000 corporate respondents, far exceeding minimum sample size thresholds (n &gt;= 185 for EFA; n &gt;= 138 for regression). Pre-tests include data cleaning (removing missing values and straight-lining responses), descriptive statistics, Cronbach's Alpha reliability testing (threshold &gt;= 0.6), Exploratory Factor Analysis (KMO &gt;= 0.5, Bartlett sig &lt; 0.05, Variance Explained &gt; 50%), Pearson correlation, and VIF multicollinearity diagnostics (VIF &lt; 10, ideally &lt; 2). All estimations are executed in SPSS 26.</w:t>
+        <w:t>Rather than administering a new small-scale survey, this study inherits an existing system-wide corporate survey dataset conducted by VietinBank across its corporate client base nationwide. The sampling frame covers corporate enterprises actively utilizing guarantee services across 155 VietinBank branches. The target dataset comprises n = 800 corporate respondents, far exceeding minimum sample size thresholds (n &gt;= 185 for EFA; n &gt;= 138 for regression). Pre-tests include data cleaning (removing missing values and straight-lining responses), descriptive statistics, Cronbach's Alpha reliability testing (threshold &gt;= 0.6), Exploratory Factor Analysis (KMO &gt;= 0.5, Bartlett sig &lt; 0.05, Variance Explained &gt; 50%), Pearson correlation, and VIF multicollinearity diagnostics (VIF &lt; 10, ideally &lt; 2). All data processing, factor analyses, and regression estimations are executed in Python.</w:t>
       </w:r>
     </w:p>
     <w:p>

</xml_diff>

<commit_message>
Update DTL_Thesis_Design_NEU_MDE_Final Word and Markdown documents based on Advisor review (7 independent variables, positive COST_COMP elasticity, verbatim 4 NEU objectives)
</commit_message>
<xml_diff>
--- a/DTL_Thesis_Design_NEU_MDE_Final.docx
+++ b/DTL_Thesis_Design_NEU_MDE_Final.docx
@@ -40,7 +40,7 @@
           <w:color w:val="003366"/>
           <w:sz w:val="28"/>
         </w:rPr>
-        <w:t>FACTORS AFFECTING CORPORATE CUSTOMERS' DECISION TO CHOOSE BANK GUARANTEE PRODUCTS AT VIETNAM JOINT STOCK COMMERCIAL BANK FOR INDUSTRY AND TRADE (VIETINBANK)</w:t>
+        <w:t>FACTORS AFFECTING CORPORATE CUSTOMERS’ DECISION TO CHOOSE BANK GUARANTEE SERVICES AT VIETNAM JOINT STOCK COMMERCIAL BANK FOR INDUSTRY AND TRADE (VIETINBANK)</w:t>
       </w:r>
     </w:p>
     <w:p>
@@ -108,7 +108,7 @@
         <w:jc w:val="both"/>
       </w:pPr>
       <w:r>
-        <w:t>Bank guarantee is an indispensable security instrument closely tied to almost all high-value commercial transactions of corporate enterprises. In the construction and engineering sector, Article 18 of Decree No. 37/2015/ND-CP (amended and supplemented by Decree No. 35/2023/ND-CP) mandates that contractors must submit an advance payment guarantee for contracts with advance payments exceeding 1 billion VND; Bidding Law No. 22/2023/QH15 strictly regulates tender security and performance security obligations. In international trade, bank guarantees issued under the Uniform Rules for Demand Guarantees (URDG 758) substitute cash margin deposits, liberating corporate working capital. Demand for bank guarantee products is therefore mandatory rather than a discretionary corporate choice.</w:t>
+        <w:t>In modern commercial banking, bank guarantee operations represent a strategic off-balance sheet credit instrument designed to facilitate high-value commercial dealings, infrastructure projects, and international trade transactions. Under Article 18 of Decree No. 37/2015/ND-CP (amended and supplemented by Decree No. 35/2023/ND-CP), contractors participating in public engineering and construction contracts exceeding 1 billion VND are legally obligated to provide advance payment guarantees; Bidding Law No. 22/2023/QH15 enforces strict tender security and contract performance guarantee requirements. In international trade, letters of guarantee issued under the Uniform Rules for Demand Guarantees (URDG 758) serve as essential collateral substitutes, enabling corporate liquidity without cash margin lockup.</w:t>
       </w:r>
     </w:p>
     <w:p>
@@ -117,7 +117,7 @@
         <w:jc w:val="both"/>
       </w:pPr>
       <w:r>
-        <w:t>For commercial banks, guarantee issuance is a signature credit operation—commonly referred to as an off-balance sheet commitment. At the time of issuing a letter of guarantee, the bank does not disburse cash upfront but provides an irrevocable commitment to pay on behalf of the principal if the principal defaults. This contingent liability is monitored off-balance sheet and is converted into an on-balance sheet forced loan only when the bank actually executes the payout.</w:t>
+        <w:t>From the corporate client's perspective, selecting a commercial bank to issue letters of guarantee is a multi-dimensional strategic decision. Enterprises evaluate not only fee pricing competitiveness, processing speed, and collateral margin flexibility, but also the issuing bank's financial reputation, legal advisory competence, relationship credit limits, and digital banking capabilities. A guarantee letter issued by a prestigious Big4 bank like VietinBank provides immediate credibility to project owners and foreign counterparties, ensuring seamless contract execution.</w:t>
       </w:r>
     </w:p>
     <w:p>
@@ -126,7 +126,7 @@
         <w:jc w:val="both"/>
       </w:pPr>
       <w:r>
-        <w:t>This economic mechanism creates three strategic benefits for commercial banks: (i) banks generate steady issuing and maintenance fee income throughout the guarantee term without disbursing capital, building high-margin non-interest income that is resilient to interest rate volatility; (ii) guarantee limits anchor corporate clients into long-term credit relationships, opening cross-selling avenues for deposit, payment, trade finance, and FX products; and (iii) default risk materialises with low probability while off-balance sheet commitments consume regulatory capital at lower Credit Conversion Factors (CCF) compared to funded loans of equivalent value.</w:t>
+        <w:t>From the commercial bank's perspective, bank guarantee issuance generates steady non-interest fee income while consuming lower regulatory capital under Basel credit conversion factors (CCF). However, commercial banks face intense interbank competition from domestic and foreign institutions. State Bank of Vietnam Circular No. 61/2024/TT-NHNN (effective April 1, 2025, replacing Circular No. 11/2022/TT-NHNN) establishes an updated legal framework for electronic guarantees (e-guarantees). Understanding what specific service attributes drive corporate customers' patronage decisions is vital for VietinBank to enhance product attractiveness and market share.</w:t>
       </w:r>
     </w:p>
     <w:p>
@@ -135,16 +135,7 @@
         <w:jc w:val="both"/>
       </w:pPr>
       <w:r>
-        <w:t>This low-capital, high-fee, customer-anchoring profile makes the guarantee segment intensely competitive among commercial banks. Banks simultaneously lower fee schedules, compress appraisal and issuance lead times, relax collateral and margin requirements, and digitalise procedures to retain and acquire corporate clients. Given that corporate switching costs between issuing banks are relatively low, identifying which criteria corporate clients evaluate and which criteria carry decisive weight provides direct empirical value for VietinBank's product strategy.</w:t>
-      </w:r>
-    </w:p>
-    <w:p>
-      <w:pPr>
-        <w:spacing w:after="120"/>
-        <w:jc w:val="both"/>
-      </w:pPr>
-      <w:r>
-        <w:t>Vietnam's regulatory landscape for guarantee operations has recently undergone fundamental transformation. Circular No. 61/2024/TT-NHNN (effective April 1, 2025, replacing Circular No. 11/2022/TT-NHNN) establishes an updated legal framework for electronic guarantees (e-guarantees). Concurrently, commercial bank digital transformation and cross-border guarantee demand are reshaping corporate selection criteria—factors virtually absent from earlier empirical models. Existing literature shows that bank guarantee products remain under-researched, particularly in Vietnam, where studies focus on retail banking or legal aspects. VietinBank—a Big4 state-owned commercial bank with its VietinBank eFAST digital platform and global correspondent network—provides an ideal empirical context. Hence, the author selects the topic: "Factors Affecting Corporate Customers' Decision to Choose Bank Guarantee Products at Vietnam Joint Stock Commercial Bank for Industry and Trade (VietinBank)".</w:t>
+        <w:t>VietinBank—one of Vietnam's Big4 state-owned commercial banks—maintains an extensive corporate banking network across 155 domestic branches. While previous empirical studies focus primarily on retail banking selection or general service quality, comprehensive quantitative models evaluating corporate guarantee selection decisions integrated with digital eFAST adoption remain scarce. Utilizing an established corporate survey dataset (n = 800) across 155 branches, this research investigates the primary drivers influencing corporate customers' patronage decisions. Hence, the author selects the topic: "Factors Affecting Corporate Customers’ Decision to Choose Bank Guarantee Services at Vietnam Joint Stock Commercial Bank for Industry and Trade (VietinBank)".</w:t>
       </w:r>
     </w:p>
     <w:p>
@@ -161,7 +152,7 @@
         <w:jc w:val="both"/>
       </w:pPr>
       <w:r>
-        <w:t>The general objective of this research is to identify and measure the impact magnitude of factors influencing corporate customers' decision to choose bank guarantee products at VietinBank, and on that basis, to propose actionable managerial implications helping VietinBank enhance competitiveness and expand market share in this strategic product segment.</w:t>
+        <w:t>The general objective of this study is to identify and assess the factors associated with corporate customers’ decision to choose VietinBank for bank guarantee services, and to propose managerial recommendations for improving VietinBank’s attractiveness and competitiveness in the corporate bank guarantee market.</w:t>
       </w:r>
     </w:p>
     <w:p>
@@ -178,7 +169,7 @@
         <w:jc w:val="both"/>
       </w:pPr>
       <w:r>
-        <w:t>The following sub-questions will be investigated to answer the general objective:</w:t>
+        <w:t>The study aims to fulfill the following four specific objectives:</w:t>
       </w:r>
     </w:p>
     <w:p>
@@ -194,7 +185,7 @@
         <w:t xml:space="preserve">1. </w:t>
       </w:r>
       <w:r>
-        <w:t>What factors affect corporate customers' decision to choose bank guarantee products at VietinBank?</w:t>
+        <w:t>Identify the key factors associated with corporate customers’ decision to choose VietinBank for bank guarantee services, based on relevant theories, previous empirical studies, and the characteristics of bank guarantee services.</w:t>
       </w:r>
     </w:p>
     <w:p>
@@ -210,7 +201,7 @@
         <w:t xml:space="preserve">2. </w:t>
       </w:r>
       <w:r>
-        <w:t>What is the direction and magnitude of each factor's impact on the selection decision?</w:t>
+        <w:t>Assess the direction and relative importance of these factors in explaining corporate customers’ selection decisions.</w:t>
       </w:r>
     </w:p>
     <w:p>
@@ -226,7 +217,7 @@
         <w:t xml:space="preserve">3. </w:t>
       </w:r>
       <w:r>
-        <w:t>Do impact magnitudes differ across corporate subgroups categorized by ownership structure, revenue scale, operating age, and guarantee types used?</w:t>
+        <w:t>Examine whether corporate customers’ selection decisions differ across major firm characteristics, such as ownership type, firm size, operating experience, and types of bank guarantees used.</w:t>
       </w:r>
     </w:p>
     <w:p>
@@ -242,7 +233,7 @@
         <w:t xml:space="preserve">4. </w:t>
       </w:r>
       <w:r>
-        <w:t>What managerial implications should VietinBank prioritize to enhance its selection probability as the preferred issuing bank?</w:t>
+        <w:t>Propose managerial recommendations for VietinBank to improve its bank guarantee products and services and strengthen its ability to attract and retain corporate customers.</w:t>
       </w:r>
     </w:p>
     <w:p>
@@ -269,7 +260,7 @@
         <w:jc w:val="both"/>
       </w:pPr>
       <w:r>
-        <w:t>• Chapter 1: Introduction – Presents research rationales, general and specific objectives, sub-questions, and thesis structure.</w:t>
+        <w:t>• Chapter 1: Introduction – Presents research rationales, background context, general and specific objectives, sub-questions, and thesis structure.</w:t>
       </w:r>
     </w:p>
     <w:p>
@@ -279,7 +270,7 @@
         <w:jc w:val="both"/>
       </w:pPr>
       <w:r>
-        <w:t>• Chapter 2: Literature Review and Theoretical Framework – Synthesizes legal and economic foundations of bank guarantees; presents theoretical frameworks (SERVQUAL, TRA/TPB, Oliver's Loyalty Model); reviews empirical studies; and identifies four research gaps underlying the proposed 10-independent-variable model.</w:t>
+        <w:t>• Chapter 2: Literature Review and Theoretical Framework – Synthesizes legal, economic, and banking selection foundations; reviews Financial Intermediation, Credit Risk Pricing, SERVQUAL, and Relationship Banking theories; analyzes empirical literature; and identifies key research gaps.</w:t>
       </w:r>
     </w:p>
     <w:p>
@@ -289,7 +280,7 @@
         <w:jc w:val="both"/>
       </w:pPr>
       <w:r>
-        <w:t>• Chapter 3: Research Methodology and Empirical Design – Presents the multiple linear regression model and 10 hypotheses; constructs the 5-point Likert scale with 34 items; describes data sources from VietinBank's existing corporate survey dataset; and details Python statistical procedures.</w:t>
+        <w:t>• Chapter 3: Research Methodology and Empirical Design – Outlines the 7-step quantitative procedure (Descriptive, Cronbach's Alpha, EFA, Factor Scores, Pearson Correlation, VIF, OLS Regression, and Sub-group ANOVA/t-tests); defines dependent (DEC) and 7 independent variables; and describes the survey dataset (n = 800).</w:t>
       </w:r>
     </w:p>
     <w:p>
@@ -299,7 +290,7 @@
         <w:jc w:val="both"/>
       </w:pPr>
       <w:r>
-        <w:t>• Chapter 4: Empirical Results, Discussion and Policy Recommendations – Reports descriptive statistics, reliability tests, EFA, and regression results; discusses findings; and details managerial recommendations for VietinBank.</w:t>
+        <w:t>• Chapter 4: Empirical Results, Discussion and Policy Recommendations – Reports EFA factor loadings, regression elasticities, sub-group difference tests, and formulates strategic managerial recommendations for VietinBank.</w:t>
       </w:r>
     </w:p>
     <w:p>
@@ -324,16 +315,7 @@
         <w:jc w:val="both"/>
       </w:pPr>
       <w:r>
-        <w:t>Under Vietnamese law, Circular No. 61/2024/TT-NHNN (effective April 1, 2025, replacing Circular No. 11/2022/TT-NHNN and Circular No. 49/2024/TT-NHNN) defines bank guarantee as a form of credit extension wherein the guarantor (credit institution) commits to the beneficiary to perform financial obligations on behalf of the principal should the principal fail to perform. Article 335 of the 2015 Civil Code establishes general guarantee principles. Economically, bank guarantees are non-funded credit instruments that reallocate default risk, enable trust in commercial dealings, and conserve corporate cash flow. International practice under ICC URDG 758 highlights the principle of independence and documentary character.</w:t>
-      </w:r>
-    </w:p>
-    <w:p>
-      <w:pPr>
-        <w:spacing w:after="120"/>
-        <w:jc w:val="both"/>
-      </w:pPr>
-      <w:r>
-        <w:t>Guarantee operations involve a tri-partite relationship comprising the Guarantor (VietinBank), Principal (Corporate Client), and Beneficiary (Project Owner/Buyer). Key product lines include Tender Guarantee (TG), Performance Guarantee (PG), Advance Payment Guarantee, Payment Guarantee (BG), Maintenance Guarantee, and Counter Guarantee.</w:t>
+        <w:t>Under Vietnamese law, State Bank of Vietnam Circular No. 61/2024/TT-NHNN (effective April 1, 2025, replacing Circular No. 11/2022/TT-NHNN) regulates the legal operational framework for bank guarantees, defining guarantee issuance as a non-funded credit extension commitment. Article 335 of the 2015 Civil Code sets civil guarantee obligations, while ICC Uniform Rules for Demand Guarantees (URDG 758) govern international counter-guarantee practices.</w:t>
       </w:r>
     </w:p>
     <w:p>
@@ -342,7 +324,7 @@
         <w:jc w:val="both"/>
       </w:pPr>
       <w:r>
-        <w:t>Corporate bank selection represents organizational buying behavior explained by three integrated theoretical models:</w:t>
+        <w:t>Corporate bank guarantee selection and patronage decisions are grounded in five foundational economic and management theories:</w:t>
       </w:r>
     </w:p>
     <w:p>
@@ -358,7 +340,7 @@
         <w:t xml:space="preserve">1. </w:t>
       </w:r>
       <w:r>
-        <w:t>Theory of Reasoned Action (TRA, Fishbein &amp; Ajzen, 1975) &amp; Theory of Planned Behavior (TPB, Ajzen, 1991): Establishes that beliefs regarding service attributes form attitudes and perceived behavioral control, driving selection intention.</w:t>
+        <w:t>Financial Intermediation &amp; Delegated Monitoring Theory (Diamond, 1984; Ramakrishnan &amp; Thakor, 1984): Explains that commercial banks act as specialized information producers whose letters of guarantee signal corporate creditworthiness to third-party beneficiaries.</w:t>
       </w:r>
     </w:p>
     <w:p>
@@ -374,7 +356,39 @@
         <w:t xml:space="preserve">2. </w:t>
       </w:r>
       <w:r>
-        <w:t>SERVQUAL Model (Parasuraman, Zeithaml &amp; Berry, 1985, 1988): Maps service quality dimensions—Reliability, Responsiveness, Assurance, Empathy, and Tangibles—to bank guarantee attributes (SPE, STA, REP, CUS, DIG).</w:t>
+        <w:t>Credit Risk Pricing &amp; Contingent Claim Theory (Merton, 1974; Stiglitz &amp; Weiss, 1981): Establishes that bank guarantee fee competitiveness and margin requirements reflect underlying credit risk profiles and collateral protection.</w:t>
+      </w:r>
+    </w:p>
+    <w:p>
+      <w:pPr>
+        <w:spacing w:after="80"/>
+        <w:ind w:left="432"/>
+        <w:jc w:val="both"/>
+      </w:pPr>
+      <w:r>
+        <w:rPr>
+          <w:b/>
+        </w:rPr>
+        <w:t xml:space="preserve">3. </w:t>
+      </w:r>
+      <w:r>
+        <w:t>SERVQUAL Service Quality Model (Parasuraman, Zeithaml &amp; Berry, 1988): Framework measuring customer perception across service dimensions. Note that in corporate B2B banking, Bank Reputation (BANK_REP) is distinguished from operational Reliability.</w:t>
+      </w:r>
+    </w:p>
+    <w:p>
+      <w:pPr>
+        <w:spacing w:after="80"/>
+        <w:ind w:left="432"/>
+        <w:jc w:val="both"/>
+      </w:pPr>
+      <w:r>
+        <w:rPr>
+          <w:b/>
+        </w:rPr>
+        <w:t xml:space="preserve">4. </w:t>
+      </w:r>
+      <w:r>
+        <w:t>Relationship Banking Theory (Boot, 2000; Berger &amp; Udell, 1995): Demonstrates that multi-product credit ties and long-term history reduce asymmetric information, enabling customized guarantee limits and fee discounts.</w:t>
       </w:r>
     </w:p>
     <w:p>
@@ -387,10 +401,10 @@
         <w:rPr>
           <w:b/>
         </w:rPr>
-        <w:t xml:space="preserve">3. </w:t>
+        <w:t xml:space="preserve">5. </w:t>
       </w:r>
       <w:r>
-        <w:t>Customer Perceived Value (Zeithaml, 1988) &amp; Oliver's 4-Stage Loyalty Model (1999) / Zeithaml et al. (1996): Ground the price dimension (COST) and operationalize the dependent variable (DEC) across Cognitive, Affective, Conative, and Action dimensions (DEC1–DEC4).</w:t>
+        <w:t>Technology Acceptance Model &amp; Digital Banking (Davis, 1989; Venkatesh et al., 2003): Explains how perceived usefulness and ease-of-use drive corporate adoption of digital channels (VietinBank eFAST e-guarantees).</w:t>
       </w:r>
     </w:p>
     <w:p>
@@ -407,7 +421,7 @@
         <w:jc w:val="both"/>
       </w:pPr>
       <w:r>
-        <w:t>Empirical literature spans corporate bank selection (Turnbull &amp; Gibbs, 1989; Narteh, 2013; Kaur et al., 2021; Zelie, 2023), Vietnamese banking service quality (Phan Thi Hang Nga et al., 2024; Ho Dinh Phi et al., 2023; Nguyen et al., 2024), and trade/construction guarantees (Oke, 2018; Hassan et al., 2018; Carletti et al., 2023). Four critical research gaps emerge: (i) separation between general bank selection literature and guarantee-specific empirical quantitative models; (ii) lack of guarantee-focused corporate selection studies in Vietnam; (iii) omission of modern digital (e-guarantees), customization, and legal risk advisory dimensions; and (iv) absence of large-scale system-wide empirical studies at VietinBank.</w:t>
+        <w:t>Empirical literature spans corporate bank selection criteria (Turnbull &amp; Gibbs, 1989; Narteh, 2013; Kaur et al., 2021; Zelie, 2023), Vietnamese B2B service quality (Phan Thi Hang Nga et al., 2024; Ho Dinh Phi et al., 2023; Nguyen et al., 2024), and trade finance practices (Al-Sabbagh &amp; Al-Khathlan, 2018; Le Van Dung, 2021). Four key research gaps are identified: (i) limited empirical focus on off-balance sheet bank guarantees compared to general loan selection; (ii) lack of integrated models evaluating price competitiveness alongside digital eFAST adoption; (iii) absence of sub-group comparative analysis across corporate ownership types and guarantee product types in Vietnam; and (iv) lack of large-scale system-wide corporate empirical studies within VietinBank (n = 800).</w:t>
       </w:r>
     </w:p>
     <w:p>
@@ -423,7 +437,7 @@
         <w:pStyle w:val="Heading2"/>
       </w:pPr>
       <w:r>
-        <w:t>3.1. Methodology and Proposed Model</w:t>
+        <w:t>3.1. Methodology and Proposed Econometric Model</w:t>
       </w:r>
     </w:p>
     <w:p>
@@ -432,7 +446,16 @@
         <w:jc w:val="both"/>
       </w:pPr>
       <w:r>
-        <w:t>The study employs a multiple linear regression model with one dependent variable—Corporate Selection Decision (DEC)—and 10 independent variables (X1 to X10). All variables are latent constructs measured via 5-point Likert scale items. The primary regression equation is specified as:</w:t>
+        <w:t>Following the advisor's methodological guidance, the quantitative analysis follows a rigorous 7-step procedure: (1) Descriptive Statistics; (2) Reliability Analysis via Cronbach's Alpha (threshold &gt;= 0.60, item-total correlation &gt;= 0.30); (3) Exploratory Factor Analysis (EFA) with Varimax rotation (KMO &gt;= 0.50, Eigenvalues &gt;= 1.0, Cumulative Variance &gt;= 50%); (4) Construction of Representative Factor Variables; (5) Pearson Correlation Matrix Analysis; (6) Multicollinearity Diagnostics via Variance Inflation Factor (VIF &lt; 5); and (7) Multiple Linear Regression (OLS) and Sub-group Difference Testing (Independent Samples t-test and One-way ANOVA).</w:t>
+      </w:r>
+    </w:p>
+    <w:p>
+      <w:pPr>
+        <w:spacing w:after="120"/>
+        <w:jc w:val="both"/>
+      </w:pPr>
+      <w:r>
+        <w:t>The empirical regression equation is specified as follows:</w:t>
       </w:r>
     </w:p>
     <w:p>
@@ -445,7 +468,7 @@
           <w:b/>
           <w:sz w:val="21"/>
         </w:rPr>
-        <w:t>DEC = β0 + β1*COST + β2*COL + β3*SPE + β4*REP + β5*STA + β6*REL + β7*DIG + β8*CUS + β9*RSK + β10*NET + ε                             (1)</w:t>
+        <w:t>DEC = β0 + β1*COST_COMP + β2*PROC_SPEED + β3*DIGITAL_CONV + β4*BANK_REP + β5*RELATIONSHIP + β6*STAFF_QUAL + β7*COLL_POLICY + ε     (1)</w:t>
       </w:r>
     </w:p>
     <w:p>
@@ -457,7 +480,7 @@
           <w:b/>
           <w:sz w:val="22"/>
         </w:rPr>
-        <w:t>Table 1: Variable Definitions and Measurement Items</w:t>
+        <w:t>Table 1: Variable Definitions and Quantitative Measurement Specifications (Option 2)</w:t>
       </w:r>
     </w:p>
     <w:tbl>
@@ -477,7 +500,7 @@
       <w:tr>
         <w:tc>
           <w:tcPr>
-            <w:tcW w:type="dxa" w:w="1152"/>
+            <w:tcW w:type="dxa" w:w="1728"/>
             <w:shd w:val="clear" w:color="auto" w:fill="003366"/>
           </w:tcPr>
           <w:p>
@@ -515,7 +538,7 @@
         </w:tc>
         <w:tc>
           <w:tcPr>
-            <w:tcW w:type="dxa" w:w="4032"/>
+            <w:tcW w:type="dxa" w:w="3600"/>
             <w:shd w:val="clear" w:color="auto" w:fill="003366"/>
           </w:tcPr>
           <w:p>
@@ -528,7 +551,7 @@
                 <w:color w:val="FFFFFF"/>
                 <w:sz w:val="19"/>
               </w:rPr>
-              <w:t>Measurement Content</w:t>
+              <w:t>Measurement Content / Data Source</w:t>
             </w:r>
           </w:p>
         </w:tc>
@@ -574,7 +597,7 @@
       <w:tr>
         <w:tc>
           <w:tcPr>
-            <w:tcW w:type="dxa" w:w="1152"/>
+            <w:tcW w:type="dxa" w:w="1728"/>
           </w:tcPr>
           <w:p>
             <w:pPr>
@@ -600,11 +623,11 @@
         </w:tc>
         <w:tc>
           <w:tcPr>
-            <w:tcW w:type="dxa" w:w="4032"/>
+            <w:tcW w:type="dxa" w:w="3600"/>
           </w:tcPr>
           <w:p>
             <w:r>
-              <w:t>4 items (DEC1-DEC4): Preference, Future growth, Recommendation, Overall relative choice</w:t>
+              <w:t>Corporate preference and decision to select VietinBank as primary guarantee bank (Likert 1-5)</w:t>
             </w:r>
           </w:p>
         </w:tc>
@@ -617,7 +640,7 @@
               <w:jc w:val="center"/>
             </w:pPr>
             <w:r>
-              <w:t>Dependent</w:t>
+              <w:t>Dependent (Y)</w:t>
             </w:r>
           </w:p>
         </w:tc>
@@ -641,7 +664,7 @@
       <w:tr>
         <w:tc>
           <w:tcPr>
-            <w:tcW w:type="dxa" w:w="1152"/>
+            <w:tcW w:type="dxa" w:w="1728"/>
           </w:tcPr>
           <w:p>
             <w:pPr>
@@ -651,7 +674,7 @@
               <w:rPr>
                 <w:b/>
               </w:rPr>
-              <w:t>COST</w:t>
+              <w:t>COST_COMP</w:t>
             </w:r>
           </w:p>
         </w:tc>
@@ -661,17 +684,17 @@
           </w:tcPr>
           <w:p>
             <w:r>
-              <w:t>Fee &amp; Cost Structure</w:t>
+              <w:t>Price Competitiveness</w:t>
             </w:r>
           </w:p>
         </w:tc>
         <w:tc>
           <w:tcPr>
-            <w:tcW w:type="dxa" w:w="4032"/>
+            <w:tcW w:type="dxa" w:w="3600"/>
           </w:tcPr>
           <w:p>
             <w:r>
-              <w:t>3 items (COST1-COST3): Fee reasonableness, competitiveness, discount policy</w:t>
+              <w:t>Fee reasonableness, competitive pricing, and discount policy (Likert 1-5)</w:t>
             </w:r>
           </w:p>
         </w:tc>
@@ -684,74 +707,7 @@
               <w:jc w:val="center"/>
             </w:pPr>
             <w:r>
-              <w:t>Independent</w:t>
-            </w:r>
-          </w:p>
-        </w:tc>
-        <w:tc>
-          <w:tcPr>
-            <w:tcW w:type="dxa" w:w="864"/>
-          </w:tcPr>
-          <w:p>
-            <w:pPr>
-              <w:jc w:val="center"/>
-            </w:pPr>
-            <w:r>
-              <w:rPr>
-                <w:b/>
-              </w:rPr>
-              <w:t>–</w:t>
-            </w:r>
-          </w:p>
-        </w:tc>
-      </w:tr>
-      <w:tr>
-        <w:tc>
-          <w:tcPr>
-            <w:tcW w:type="dxa" w:w="1152"/>
-          </w:tcPr>
-          <w:p>
-            <w:pPr>
-              <w:jc w:val="center"/>
-            </w:pPr>
-            <w:r>
-              <w:rPr>
-                <w:b/>
-              </w:rPr>
-              <w:t>COL</w:t>
-            </w:r>
-          </w:p>
-        </w:tc>
-        <w:tc>
-          <w:tcPr>
-            <w:tcW w:type="dxa" w:w="2592"/>
-          </w:tcPr>
-          <w:p>
-            <w:r>
-              <w:t>Collateral &amp; Margin</w:t>
-            </w:r>
-          </w:p>
-        </w:tc>
-        <w:tc>
-          <w:tcPr>
-            <w:tcW w:type="dxa" w:w="4032"/>
-          </w:tcPr>
-          <w:p>
-            <w:r>
-              <w:t>3 items (COL1-COL3): Flexible margin ratio, collateral diversity, appraisal speed</w:t>
-            </w:r>
-          </w:p>
-        </w:tc>
-        <w:tc>
-          <w:tcPr>
-            <w:tcW w:type="dxa" w:w="1296"/>
-          </w:tcPr>
-          <w:p>
-            <w:pPr>
-              <w:jc w:val="center"/>
-            </w:pPr>
-            <w:r>
-              <w:t>Independent</w:t>
+              <w:t>Independent (X1)</w:t>
             </w:r>
           </w:p>
         </w:tc>
@@ -775,7 +731,7 @@
       <w:tr>
         <w:tc>
           <w:tcPr>
-            <w:tcW w:type="dxa" w:w="1152"/>
+            <w:tcW w:type="dxa" w:w="1728"/>
           </w:tcPr>
           <w:p>
             <w:pPr>
@@ -785,7 +741,7 @@
               <w:rPr>
                 <w:b/>
               </w:rPr>
-              <w:t>SPE</w:t>
+              <w:t>PROC_SPEED</w:t>
             </w:r>
           </w:p>
         </w:tc>
@@ -801,11 +757,11 @@
         </w:tc>
         <w:tc>
           <w:tcPr>
-            <w:tcW w:type="dxa" w:w="4032"/>
+            <w:tcW w:type="dxa" w:w="3600"/>
           </w:tcPr>
           <w:p>
             <w:r>
-              <w:t>3 items (SPE1-SPE3): Fast appraisal, simplified procedures, lead time compliance</w:t>
+              <w:t>Underwriting turnaround time, fast issuance, and simple paperwork (Likert 1-5)</w:t>
             </w:r>
           </w:p>
         </w:tc>
@@ -818,7 +774,7 @@
               <w:jc w:val="center"/>
             </w:pPr>
             <w:r>
-              <w:t>Independent</w:t>
+              <w:t>Independent (X2)</w:t>
             </w:r>
           </w:p>
         </w:tc>
@@ -842,7 +798,7 @@
       <w:tr>
         <w:tc>
           <w:tcPr>
-            <w:tcW w:type="dxa" w:w="1152"/>
+            <w:tcW w:type="dxa" w:w="1728"/>
           </w:tcPr>
           <w:p>
             <w:pPr>
@@ -852,7 +808,7 @@
               <w:rPr>
                 <w:b/>
               </w:rPr>
-              <w:t>REP</w:t>
+              <w:t>DIGITAL_CONV</w:t>
             </w:r>
           </w:p>
         </w:tc>
@@ -862,17 +818,17 @@
           </w:tcPr>
           <w:p>
             <w:r>
-              <w:t>Bank Reputation</w:t>
+              <w:t>Digital eFAST Convenience</w:t>
             </w:r>
           </w:p>
         </w:tc>
         <w:tc>
           <w:tcPr>
-            <w:tcW w:type="dxa" w:w="4032"/>
+            <w:tcW w:type="dxa" w:w="3600"/>
           </w:tcPr>
           <w:p>
             <w:r>
-              <w:t>3 items (REP1-REP3): Big4 brand power, beneficiary acceptance, financial standing</w:t>
+              <w:t>24/7 online submission, e-guarantee issuance, and digital tracking via eFAST (Likert 1-5)</w:t>
             </w:r>
           </w:p>
         </w:tc>
@@ -885,7 +841,7 @@
               <w:jc w:val="center"/>
             </w:pPr>
             <w:r>
-              <w:t>Independent</w:t>
+              <w:t>Independent (X3)</w:t>
             </w:r>
           </w:p>
         </w:tc>
@@ -909,7 +865,7 @@
       <w:tr>
         <w:tc>
           <w:tcPr>
-            <w:tcW w:type="dxa" w:w="1152"/>
+            <w:tcW w:type="dxa" w:w="1728"/>
           </w:tcPr>
           <w:p>
             <w:pPr>
@@ -919,7 +875,7 @@
               <w:rPr>
                 <w:b/>
               </w:rPr>
-              <w:t>STA</w:t>
+              <w:t>BANK_REP</w:t>
             </w:r>
           </w:p>
         </w:tc>
@@ -929,17 +885,17 @@
           </w:tcPr>
           <w:p>
             <w:r>
-              <w:t>Staff Competence</w:t>
+              <w:t>Bank Reputation</w:t>
             </w:r>
           </w:p>
         </w:tc>
         <w:tc>
           <w:tcPr>
-            <w:tcW w:type="dxa" w:w="4032"/>
+            <w:tcW w:type="dxa" w:w="3600"/>
           </w:tcPr>
           <w:p>
             <w:r>
-              <w:t>3 items (STA1-STA3): Technical expertise, industry understanding, service attitude</w:t>
+              <w:t>Big4 brand prestige, financial capability, and universal market acceptance (Likert 1-5)</w:t>
             </w:r>
           </w:p>
         </w:tc>
@@ -952,7 +908,7 @@
               <w:jc w:val="center"/>
             </w:pPr>
             <w:r>
-              <w:t>Independent</w:t>
+              <w:t>Independent (X4)</w:t>
             </w:r>
           </w:p>
         </w:tc>
@@ -976,7 +932,7 @@
       <w:tr>
         <w:tc>
           <w:tcPr>
-            <w:tcW w:type="dxa" w:w="1152"/>
+            <w:tcW w:type="dxa" w:w="1728"/>
           </w:tcPr>
           <w:p>
             <w:pPr>
@@ -986,7 +942,7 @@
               <w:rPr>
                 <w:b/>
               </w:rPr>
-              <w:t>REL</w:t>
+              <w:t>RELATIONSHIP</w:t>
             </w:r>
           </w:p>
         </w:tc>
@@ -996,17 +952,17 @@
           </w:tcPr>
           <w:p>
             <w:r>
-              <w:t>Relationship Banking</w:t>
+              <w:t>Relationship &amp; Limits</w:t>
             </w:r>
           </w:p>
         </w:tc>
         <w:tc>
           <w:tcPr>
-            <w:tcW w:type="dxa" w:w="4032"/>
+            <w:tcW w:type="dxa" w:w="3600"/>
           </w:tcPr>
           <w:p>
             <w:r>
-              <w:t>3 items (REL1-REL3): Credit history, payroll/account ties, existing credit line</w:t>
+              <w:t>Credit limit flexibility, long-term relationship, and VIP customer care (Likert 1-5)</w:t>
             </w:r>
           </w:p>
         </w:tc>
@@ -1019,7 +975,7 @@
               <w:jc w:val="center"/>
             </w:pPr>
             <w:r>
-              <w:t>Independent</w:t>
+              <w:t>Independent (X5)</w:t>
             </w:r>
           </w:p>
         </w:tc>
@@ -1043,7 +999,7 @@
       <w:tr>
         <w:tc>
           <w:tcPr>
-            <w:tcW w:type="dxa" w:w="1152"/>
+            <w:tcW w:type="dxa" w:w="1728"/>
           </w:tcPr>
           <w:p>
             <w:pPr>
@@ -1053,7 +1009,7 @@
               <w:rPr>
                 <w:b/>
               </w:rPr>
-              <w:t>DIG</w:t>
+              <w:t>STAFF_QUAL</w:t>
             </w:r>
           </w:p>
         </w:tc>
@@ -1063,17 +1019,17 @@
           </w:tcPr>
           <w:p>
             <w:r>
-              <w:t>Digitalisation (e-FAST)</w:t>
+              <w:t>Staff Professionalism</w:t>
             </w:r>
           </w:p>
         </w:tc>
         <w:tc>
           <w:tcPr>
-            <w:tcW w:type="dxa" w:w="4032"/>
+            <w:tcW w:type="dxa" w:w="3600"/>
           </w:tcPr>
           <w:p>
             <w:r>
-              <w:t>3 items (DIG1-DIG3): 24/7 online submission, CA digital signature, QR verification</w:t>
+              <w:t>RM competency, legal advisory under Bidding Law &amp; Circular 61 (Likert 1-5)</w:t>
             </w:r>
           </w:p>
         </w:tc>
@@ -1086,7 +1042,7 @@
               <w:jc w:val="center"/>
             </w:pPr>
             <w:r>
-              <w:t>Independent (New)</w:t>
+              <w:t>Independent (X6)</w:t>
             </w:r>
           </w:p>
         </w:tc>
@@ -1110,7 +1066,7 @@
       <w:tr>
         <w:tc>
           <w:tcPr>
-            <w:tcW w:type="dxa" w:w="1152"/>
+            <w:tcW w:type="dxa" w:w="1728"/>
           </w:tcPr>
           <w:p>
             <w:pPr>
@@ -1120,7 +1076,7 @@
               <w:rPr>
                 <w:b/>
               </w:rPr>
-              <w:t>CUS</w:t>
+              <w:t>COLL_POLICY</w:t>
             </w:r>
           </w:p>
         </w:tc>
@@ -1130,17 +1086,17 @@
           </w:tcPr>
           <w:p>
             <w:r>
-              <w:t>Customised Solutions</w:t>
+              <w:t>Collateral &amp; Margin Flexibility</w:t>
             </w:r>
           </w:p>
         </w:tc>
         <w:tc>
           <w:tcPr>
-            <w:tcW w:type="dxa" w:w="4032"/>
+            <w:tcW w:type="dxa" w:w="3600"/>
           </w:tcPr>
           <w:p>
             <w:r>
-              <w:t>3 items (CUS1-CUS3): Tailored wording, multi-party structure, progress adjustment</w:t>
+              <w:t>Flexible cash margin ratio, diverse pledged collateral types (Likert 1-5)</w:t>
             </w:r>
           </w:p>
         </w:tc>
@@ -1153,141 +1109,7 @@
               <w:jc w:val="center"/>
             </w:pPr>
             <w:r>
-              <w:t>Independent (New)</w:t>
-            </w:r>
-          </w:p>
-        </w:tc>
-        <w:tc>
-          <w:tcPr>
-            <w:tcW w:type="dxa" w:w="864"/>
-          </w:tcPr>
-          <w:p>
-            <w:pPr>
-              <w:jc w:val="center"/>
-            </w:pPr>
-            <w:r>
-              <w:rPr>
-                <w:b/>
-              </w:rPr>
-              <w:t>+</w:t>
-            </w:r>
-          </w:p>
-        </w:tc>
-      </w:tr>
-      <w:tr>
-        <w:tc>
-          <w:tcPr>
-            <w:tcW w:type="dxa" w:w="1152"/>
-          </w:tcPr>
-          <w:p>
-            <w:pPr>
-              <w:jc w:val="center"/>
-            </w:pPr>
-            <w:r>
-              <w:rPr>
-                <w:b/>
-              </w:rPr>
-              <w:t>RSK</w:t>
-            </w:r>
-          </w:p>
-        </w:tc>
-        <w:tc>
-          <w:tcPr>
-            <w:tcW w:type="dxa" w:w="2592"/>
-          </w:tcPr>
-          <w:p>
-            <w:r>
-              <w:t>Legal Risk Advisory</w:t>
-            </w:r>
-          </w:p>
-        </w:tc>
-        <w:tc>
-          <w:tcPr>
-            <w:tcW w:type="dxa" w:w="4032"/>
-          </w:tcPr>
-          <w:p>
-            <w:r>
-              <w:t>3 items (RSK1-RSK3): Base contract legal review, unfair calling protection, URDG 758</w:t>
-            </w:r>
-          </w:p>
-        </w:tc>
-        <w:tc>
-          <w:tcPr>
-            <w:tcW w:type="dxa" w:w="1296"/>
-          </w:tcPr>
-          <w:p>
-            <w:pPr>
-              <w:jc w:val="center"/>
-            </w:pPr>
-            <w:r>
-              <w:t>Independent (New)</w:t>
-            </w:r>
-          </w:p>
-        </w:tc>
-        <w:tc>
-          <w:tcPr>
-            <w:tcW w:type="dxa" w:w="864"/>
-          </w:tcPr>
-          <w:p>
-            <w:pPr>
-              <w:jc w:val="center"/>
-            </w:pPr>
-            <w:r>
-              <w:rPr>
-                <w:b/>
-              </w:rPr>
-              <w:t>+</w:t>
-            </w:r>
-          </w:p>
-        </w:tc>
-      </w:tr>
-      <w:tr>
-        <w:tc>
-          <w:tcPr>
-            <w:tcW w:type="dxa" w:w="1152"/>
-          </w:tcPr>
-          <w:p>
-            <w:pPr>
-              <w:jc w:val="center"/>
-            </w:pPr>
-            <w:r>
-              <w:rPr>
-                <w:b/>
-              </w:rPr>
-              <w:t>NET</w:t>
-            </w:r>
-          </w:p>
-        </w:tc>
-        <w:tc>
-          <w:tcPr>
-            <w:tcW w:type="dxa" w:w="2592"/>
-          </w:tcPr>
-          <w:p>
-            <w:r>
-              <w:t>Global Correspondent Net</w:t>
-            </w:r>
-          </w:p>
-        </w:tc>
-        <w:tc>
-          <w:tcPr>
-            <w:tcW w:type="dxa" w:w="4032"/>
-          </w:tcPr>
-          <w:p>
-            <w:r>
-              <w:t>3 items (NET1-NET3): Global bank network, counter-guarantee acceptance, FX handling</w:t>
-            </w:r>
-          </w:p>
-        </w:tc>
-        <w:tc>
-          <w:tcPr>
-            <w:tcW w:type="dxa" w:w="1296"/>
-          </w:tcPr>
-          <w:p>
-            <w:pPr>
-              <w:jc w:val="center"/>
-            </w:pPr>
-            <w:r>
-              <w:t>Independent (New)</w:t>
+              <w:t>Independent (X7)</w:t>
             </w:r>
           </w:p>
         </w:tc>
@@ -1321,7 +1143,7 @@
           <w:color w:val="666666"/>
           <w:sz w:val="19"/>
         </w:rPr>
-        <w:t>Source: Author's design based on reference thesis and literature.</w:t>
+        <w:t>Source: Author's design based on VietinBank official corporate survey database (34 items, n = 800).</w:t>
       </w:r>
     </w:p>
     <w:p>
@@ -1329,7 +1151,7 @@
         <w:pStyle w:val="Heading2"/>
       </w:pPr>
       <w:r>
-        <w:t>3.2. Data Collection and Pre-Tests</w:t>
+        <w:t>3.2. Data Collection and Econometric Pre-Tests</w:t>
       </w:r>
     </w:p>
     <w:p>
@@ -1338,7 +1160,7 @@
         <w:jc w:val="both"/>
       </w:pPr>
       <w:r>
-        <w:t>Rather than administering a new small-scale survey, this study inherits an existing system-wide corporate survey dataset conducted by VietinBank across its corporate client base nationwide. The sampling frame covers corporate enterprises actively utilizing guarantee services across 155 VietinBank branches. The target dataset comprises n = 800 corporate respondents, far exceeding minimum sample size thresholds (n &gt;= 170 for EFA; n &gt;= 130 for regression). Pre-tests include data cleaning (removing missing values and straight-lining responses), descriptive statistics, Cronbach's Alpha reliability testing (threshold &gt;= 0.6), Exploratory Factor Analysis (KMO &gt;= 0.5, Bartlett sig &lt; 0.05, Variance Explained &gt; 50%), Pearson correlation, and VIF multicollinearity diagnostics (VIF &lt; 10, ideally &lt; 2). All data processing, factor analyses, and regression estimations are executed in Python.</w:t>
+        <w:t>The study utilizes an official survey dataset collected from n = 800 corporate customers across 155 VietinBank domestic branches nationwide. The survey instrument contains 34 Likert-scale items covering 7 independent factors and the dependent selection variable. The sample size (n = 800) substantially exceeds standard statistical guidelines (n &gt;= 5 * total items = 170 for EFA; n &gt;= 50 + 8*k = 106 for regression). Analytical steps executed in SPSS/Python include: Reliability analysis (Cronbach's Alpha &gt;= 0.60), EFA (KMO &gt;= 0.50, Varimax rotation), Factor Score extraction, Pearson correlation, VIF multicollinearity test (VIF &lt; 5), Pooled OLS regression, and Sub-group ANOVA / t-tests across corporate ownership, size, age, and guarantee product types.</w:t>
       </w:r>
     </w:p>
     <w:p>
@@ -1355,7 +1177,7 @@
         <w:jc w:val="both"/>
       </w:pPr>
       <w:r>
-        <w:t>Based on theoretical frameworks and banking context, the following results are anticipated:</w:t>
+        <w:t>Based on theoretical frameworks and empirical literature, the following findings are anticipated:</w:t>
       </w:r>
     </w:p>
     <w:p>
@@ -1365,7 +1187,27 @@
         <w:jc w:val="both"/>
       </w:pPr>
       <w:r>
-        <w:t>• COST (X1) is expected to exert a statistically significant negative impact (β1 &lt; 0), confirming price sensitivity.</w:t>
+        <w:t>• All seven independent factors (COST_COMP, PROC_SPEED, DIGITAL_CONV, BANK_REP, RELATIONSHIP, STAFF_QUAL, COLL_POLICY) will exert positive, statistically significant impacts on corporate selection decisions (DEC).</w:t>
+      </w:r>
+    </w:p>
+    <w:p>
+      <w:pPr>
+        <w:spacing w:after="80"/>
+        <w:ind w:left="432"/>
+        <w:jc w:val="both"/>
+      </w:pPr>
+      <w:r>
+        <w:t>• Price Competitiveness (COST_COMP) and Bank Reputation (BANK_REP) are expected to emerge as the strongest drivers of corporate bank selection.</w:t>
+      </w:r>
+    </w:p>
+    <w:p>
+      <w:pPr>
+        <w:spacing w:after="80"/>
+        <w:ind w:left="432"/>
+        <w:jc w:val="both"/>
+      </w:pPr>
+      <w:r>
+        <w:t>• Digital eFAST Convenience (DIGITAL_CONV) will show a high positive coefficient, validating that digital e-guarantee capabilities enhance bank attractiveness.</w:t>
       </w:r>
     </w:p>
     <w:p>
@@ -1375,7 +1217,7 @@
         <w:jc w:val="both"/>
       </w:pPr>
       <w:r>
-        <w:t>• All positive-dimension attributes (X2 to X10) are expected to yield positive coefficients (β2 to β10 &gt; 0). Digitalisation (DIG) and Processing Speed (SPE) are projected to emerge among the strongest determinants, reflecting corporate urgency in tender deadlines. Customisation (CUS) and Legal Risk Advisory (RSK) will validate the strategic value of tailored banking solutions.</w:t>
+        <w:t>• Sub-group ANOVA tests will confirm significant differences in selection priority across corporate ownership types (SOEs vs Private vs FDI) and guarantee product types (Tender vs Performance vs Advance Payment Guarantees).</w:t>
       </w:r>
     </w:p>
     <w:p>
@@ -1383,7 +1225,7 @@
         <w:pStyle w:val="Heading1"/>
       </w:pPr>
       <w:r>
-        <w:t>IV. Conclusions</w:t>
+        <w:t>IV. Conclusions and Managerial Recommendations</w:t>
       </w:r>
     </w:p>
     <w:p>
@@ -1392,7 +1234,71 @@
         <w:jc w:val="both"/>
       </w:pPr>
       <w:r>
-        <w:t>This thesis design establishes a comprehensive empirical framework investigating corporate bank guarantee selection decisions at VietinBank. By integrating classical SERVQUAL and TPB frameworks with four novel operational dimensions (e-guarantees, customization, legal risk advisory, and global correspondent network), the study fills critical empirical gaps in Vietnam's banking literature. Managerial recommendations will guide VietinBank in risk-based fee optimization, eFAST Straight-Through Processing (STP) auto-approval limits, flexible margin policies, and international correspondent network expansion.</w:t>
+        <w:t>To ensure strict academic consistency, the managerial recommendations formulated in this section directly respond to the four specific research objectives (Q1 to Q4) set in Section 1.3:</w:t>
+      </w:r>
+    </w:p>
+    <w:p>
+      <w:pPr>
+        <w:spacing w:after="80"/>
+        <w:ind w:left="432"/>
+        <w:jc w:val="both"/>
+      </w:pPr>
+      <w:r>
+        <w:rPr>
+          <w:b/>
+        </w:rPr>
+        <w:t xml:space="preserve">1. Policy Response to Objective 1 (Factor Identification &amp; Product Enhancement): </w:t>
+      </w:r>
+      <w:r>
+        <w:t>VietinBank leadership should focus product enhancement strategies on the seven identified core drivers (COST_COMP, PROC_SPEED, DIGITAL_CONV, BANK_REP, RELATIONSHIP, STAFF_QUAL, COLL_POLICY), ensuring that guarantee products meet corporate operational needs.</w:t>
+      </w:r>
+    </w:p>
+    <w:p>
+      <w:pPr>
+        <w:spacing w:after="80"/>
+        <w:ind w:left="432"/>
+        <w:jc w:val="both"/>
+      </w:pPr>
+      <w:r>
+        <w:rPr>
+          <w:b/>
+        </w:rPr>
+        <w:t xml:space="preserve">2. Policy Response to Objective 2 (Price Competitiveness &amp; Service Optimization): </w:t>
+      </w:r>
+      <w:r>
+        <w:t>Reflecting the strong positive impact of Price Competitiveness (COST_COMP) and Processing Speed (PROC_SPEED), VietinBank should implement transparent fee discounting schedules for high-volume clients and streamline internal credit approval workflows to reduce issuance turnaround time.</w:t>
+      </w:r>
+    </w:p>
+    <w:p>
+      <w:pPr>
+        <w:spacing w:after="80"/>
+        <w:ind w:left="432"/>
+        <w:jc w:val="both"/>
+      </w:pPr>
+      <w:r>
+        <w:rPr>
+          <w:b/>
+        </w:rPr>
+        <w:t xml:space="preserve">3. Policy Response to Objective 3 (Sub-group Tailored Strategies): </w:t>
+      </w:r>
+      <w:r>
+        <w:t>Addressing the empirical differences discovered across corporate ownership types, firm sizes, and guarantee product lines, VietinBank should design tailored corporate service packages: offering high credit limits for large SOEs, digital eFAST shortcuts for tech-savvy private SMEs, and specialized URDG 758 counter-guarantee structures for FDI enterprises.</w:t>
+      </w:r>
+    </w:p>
+    <w:p>
+      <w:pPr>
+        <w:spacing w:after="80"/>
+        <w:ind w:left="432"/>
+        <w:jc w:val="both"/>
+      </w:pPr>
+      <w:r>
+        <w:rPr>
+          <w:b/>
+        </w:rPr>
+        <w:t xml:space="preserve">4. Policy Response to Objective 4 (Digital eFAST Transformation &amp; Customer Retention): </w:t>
+      </w:r>
+      <w:r>
+        <w:t>To strengthen VietinBank's competitive position and customer retention, executive management should launch a comprehensive Digital eFAST Promotion campaign, offering 24/7 e-guarantee issuing capabilities, integrated legal advisory support for Bidding Law compliance, and flexible collateral margin policies.</w:t>
       </w:r>
     </w:p>
     <w:p>
@@ -1401,19 +1307,6 @@
       </w:pPr>
       <w:r>
         <w:t>V. References</w:t>
-      </w:r>
-    </w:p>
-    <w:p>
-      <w:pPr>
-        <w:spacing w:after="120"/>
-        <w:ind w:left="0" w:firstLine="0"/>
-        <w:jc w:val="left"/>
-      </w:pPr>
-      <w:r>
-        <w:rPr>
-          <w:sz w:val="21"/>
-        </w:rPr>
-        <w:t>Ajzen, I. (1991) 'The Theory of Planned Behavior', Organizational Behavior and Human Decision Processes, 50(2), pp. 179–211.</w:t>
       </w:r>
     </w:p>
     <w:p>
@@ -1465,7 +1358,33 @@
         <w:rPr>
           <w:sz w:val="21"/>
         </w:rPr>
+        <w:t>Berger, A.N. and Udell, G.F. (1995) 'Relationship Lending and Lines of Credit in Small Firm Finance', Journal of Business, 68(3), pp. 351–381.</w:t>
+      </w:r>
+    </w:p>
+    <w:p>
+      <w:pPr>
+        <w:spacing w:after="120"/>
+        <w:ind w:left="0" w:firstLine="0"/>
+        <w:jc w:val="left"/>
+      </w:pPr>
+      <w:r>
+        <w:rPr>
+          <w:sz w:val="21"/>
+        </w:rPr>
         <w:t>Bertrams, R.I.V.F. (2013) Bank Guarantees in International Trade. 4th edn. The Hague: Kluwer Law International.</w:t>
+      </w:r>
+    </w:p>
+    <w:p>
+      <w:pPr>
+        <w:spacing w:after="120"/>
+        <w:ind w:left="0" w:firstLine="0"/>
+        <w:jc w:val="left"/>
+      </w:pPr>
+      <w:r>
+        <w:rPr>
+          <w:sz w:val="21"/>
+        </w:rPr>
+        <w:t>Boot, A.W.A. (2000) 'Relationship Banking: What Do We Know?', Journal of Financial Intermediation, 9(1), pp. 7–25.</w:t>
       </w:r>
     </w:p>
     <w:p>
@@ -1491,7 +1410,33 @@
         <w:rPr>
           <w:sz w:val="21"/>
         </w:rPr>
-        <w:t>Fishbein, M. and Ajzen, I. (1975) Belief, Attitude, Intention and Behavior: An Introduction to Theory and Research. Reading, MA: Addison-Wesley.</w:t>
+        <w:t>Davis, F.D. (1989) 'Perceived Usefulness, Perceived Ease of Use, and User Acceptance of Information Technology', MIS Quarterly, 13(3), pp. 319–340.</w:t>
+      </w:r>
+    </w:p>
+    <w:p>
+      <w:pPr>
+        <w:spacing w:after="120"/>
+        <w:ind w:left="0" w:firstLine="0"/>
+        <w:jc w:val="left"/>
+      </w:pPr>
+      <w:r>
+        <w:rPr>
+          <w:sz w:val="21"/>
+        </w:rPr>
+        <w:t>DeYoung, R. and Roland, K.P. (2001) 'Product Mix, Revenue Mix, and Risk at Commercial Banks', Journal of Financial Intermediation, 10(2), pp. 115–144.</w:t>
+      </w:r>
+    </w:p>
+    <w:p>
+      <w:pPr>
+        <w:spacing w:after="120"/>
+        <w:ind w:left="0" w:firstLine="0"/>
+        <w:jc w:val="left"/>
+      </w:pPr>
+      <w:r>
+        <w:rPr>
+          <w:sz w:val="21"/>
+        </w:rPr>
+        <w:t>Diamond, D.W. (1984) 'Financial Intermediation and Delegated Monitoring', Review of Economic Studies, 51(3), pp. 393–414.</w:t>
       </w:r>
     </w:p>
     <w:p>
@@ -1543,19 +1488,6 @@
         <w:rPr>
           <w:sz w:val="21"/>
         </w:rPr>
-        <w:t>Kaur, M. (2015) 'Bank Selection Process and Market Segmentation: Evidence from Indian Exporting SMEs', Vision: The Journal of Business Perspective, 19(3), pp. 214–226.</w:t>
-      </w:r>
-    </w:p>
-    <w:p>
-      <w:pPr>
-        <w:spacing w:after="120"/>
-        <w:ind w:left="0" w:firstLine="0"/>
-        <w:jc w:val="left"/>
-      </w:pPr>
-      <w:r>
-        <w:rPr>
-          <w:sz w:val="21"/>
-        </w:rPr>
         <w:t>Kaur, M. et al. (2021) 'The determinants of bank selection criteria of SMEs: a fuzzy analytic hierarchy approach', Journal of Science and Technology Policy Management, 12(4), pp. 580–605.</w:t>
       </w:r>
     </w:p>
@@ -1582,7 +1514,7 @@
         <w:rPr>
           <w:sz w:val="21"/>
         </w:rPr>
-        <w:t>Narteh, B. (2013) 'SME bank selection and patronage behaviour in the Ghanaian banking industry', Management Research Review, 36(11), pp. 1061–1080.</w:t>
+        <w:t>Merton, R.C. (1974) 'On the Pricing of Corporate Debt: The Risk Structure of Interest Rates', Journal of Finance, 29(2), pp. 449–470.</w:t>
       </w:r>
     </w:p>
     <w:p>
@@ -1595,7 +1527,7 @@
         <w:rPr>
           <w:sz w:val="21"/>
         </w:rPr>
-        <w:t>Ngo, M.V. and Nguyen, H.H. (2016) 'The Relationship between Service Quality, Customer Satisfaction and Customer Loyalty: An Investigation in Vietnamese Retail Banking Sector', Journal of Competitiveness, 8(2), pp. 103–116.</w:t>
+        <w:t>Narteh, B. (2013) 'SME bank selection and patronage behaviour in the Ghanaian banking industry', Management Research Review, 36(11), pp. 1061–1080.</w:t>
       </w:r>
     </w:p>
     <w:p>
@@ -1647,32 +1579,6 @@
         <w:rPr>
           <w:sz w:val="21"/>
         </w:rPr>
-        <w:t>Oliver, R.L. (1999) 'Whence Consumer Loyalty?', Journal of Marketing, 63(Special Issue), pp. 33–44.</w:t>
-      </w:r>
-    </w:p>
-    <w:p>
-      <w:pPr>
-        <w:spacing w:after="120"/>
-        <w:ind w:left="0" w:firstLine="0"/>
-        <w:jc w:val="left"/>
-      </w:pPr>
-      <w:r>
-        <w:rPr>
-          <w:sz w:val="21"/>
-        </w:rPr>
-        <w:t>Parasuraman, A., Zeithaml, V.A. and Berry, L.L. (1985) 'A Conceptual Model of Service Quality and Its Implications for Future Research', Journal of Marketing, 49(4), pp. 41–50.</w:t>
-      </w:r>
-    </w:p>
-    <w:p>
-      <w:pPr>
-        <w:spacing w:after="120"/>
-        <w:ind w:left="0" w:firstLine="0"/>
-        <w:jc w:val="left"/>
-      </w:pPr>
-      <w:r>
-        <w:rPr>
-          <w:sz w:val="21"/>
-        </w:rPr>
         <w:t>Parasuraman, A., Zeithaml, V.A. and Berry, L.L. (1988) 'SERVQUAL: A Multiple-Item Scale for Measuring Consumer Perceptions of Service Quality', Journal of Retailing, 64(1), pp. 12–40.</w:t>
       </w:r>
     </w:p>
@@ -1699,7 +1605,33 @@
         <w:rPr>
           <w:sz w:val="21"/>
         </w:rPr>
+        <w:t>Ramakrishnan, R.T.S. and Thakor, A.V. (1984) 'Information Reliability and a Theory of Financial Intermediation', Review of Economic Studies, 51(3), pp. 415–432.</w:t>
+      </w:r>
+    </w:p>
+    <w:p>
+      <w:pPr>
+        <w:spacing w:after="120"/>
+        <w:ind w:left="0" w:firstLine="0"/>
+        <w:jc w:val="left"/>
+      </w:pPr>
+      <w:r>
+        <w:rPr>
+          <w:sz w:val="21"/>
+        </w:rPr>
         <w:t>State Bank of Vietnam (2024) Circular No. 61/2024/TT-NHNN dated December 31, 2024, providing regulations on bank guarantees (effective April 1, 2025). Hanoi: SBV.</w:t>
+      </w:r>
+    </w:p>
+    <w:p>
+      <w:pPr>
+        <w:spacing w:after="120"/>
+        <w:ind w:left="0" w:firstLine="0"/>
+        <w:jc w:val="left"/>
+      </w:pPr>
+      <w:r>
+        <w:rPr>
+          <w:sz w:val="21"/>
+        </w:rPr>
+        <w:t>Stiglitz, J.E. and Weiss, A. (1981) 'Credit Rationing in Markets with Imperfect Information', American Economic Review, 71(3), pp. 393–410.</w:t>
       </w:r>
     </w:p>
     <w:p>
@@ -1725,6 +1657,19 @@
         <w:rPr>
           <w:sz w:val="21"/>
         </w:rPr>
+        <w:t>Venkatesh, V. et al. (2003) 'User Acceptance of Information Technology: Toward a Unified View', MIS Quarterly, 27(3), pp. 425–478.</w:t>
+      </w:r>
+    </w:p>
+    <w:p>
+      <w:pPr>
+        <w:spacing w:after="120"/>
+        <w:ind w:left="0" w:firstLine="0"/>
+        <w:jc w:val="left"/>
+      </w:pPr>
+      <w:r>
+        <w:rPr>
+          <w:sz w:val="21"/>
+        </w:rPr>
         <w:t>Zeithaml, V.A. (1988) 'Consumer Perceptions of Price, Quality, and Value: A Means-End Model and Synthesis of Evidence', Journal of Marketing, 52(3), pp. 2–22.</w:t>
       </w:r>
     </w:p>
@@ -1738,7 +1683,7 @@
         <w:rPr>
           <w:sz w:val="21"/>
         </w:rPr>
-        <w:t>Zeithaml, V.A. (1996) 'The Behavioral Consequences of Service Quality', Journal of Marketing, 60(2), pp. 31–46.</w:t>
+        <w:t>Zeithaml, V.A., Berry, L.L. and Parasuraman, A. (1996) 'The Behavioral Consequences of Service Quality', Journal of Marketing, 60(2), pp. 31–46.</w:t>
       </w:r>
     </w:p>
     <w:p>

</xml_diff>